<commit_message>
[Lane 1] USA26046 report: new radiant outlet graphic (Jesse)
Co-Authored-By: Claude Opus 5.5 <noreply@anthropic.com>
</commit_message>
<xml_diff>
--- a/02-facilities/Cenovus/Lima-OH/USA26046-Cenovus-Lima-Job-Report.docx
+++ b/02-facilities/Cenovus/Lima-OH/USA26046-Cenovus-Lima-Job-Report.docx
@@ -4775,7 +4775,7 @@
       <w:r>
         <w:drawing>
           <wp:inline xmlns:a="http://schemas.openxmlformats.org/drawingml/2006/main" xmlns:pic="http://schemas.openxmlformats.org/drawingml/2006/picture">
-            <wp:extent cx="3657600" cy="1632857"/>
+            <wp:extent cx="5486400" cy="1841466"/>
             <wp:docPr id="2" name="Picture 2"/>
             <wp:cNvGraphicFramePr>
               <a:graphicFrameLocks noChangeAspect="1"/>
@@ -4784,7 +4784,7 @@
               <a:graphicData uri="http://schemas.openxmlformats.org/drawingml/2006/picture">
                 <pic:pic>
                   <pic:nvPicPr>
-                    <pic:cNvPr id="0" name="USA26046-vac-radiant-outlet-layout.png"/>
+                    <pic:cNvPr id="0" name="USA26046-vac-radiant-outlet-layout.jpg"/>
                     <pic:cNvPicPr/>
                   </pic:nvPicPr>
                   <pic:blipFill>
@@ -4796,7 +4796,7 @@
                   <pic:spPr>
                     <a:xfrm>
                       <a:off x="0" y="0"/>
-                      <a:ext cx="3657600" cy="1632857"/>
+                      <a:ext cx="5486400" cy="1841466"/>
                     </a:xfrm>
                     <a:prstGeom prst="rect"/>
                   </pic:spPr>

</xml_diff>

<commit_message>
[Lane 1] USA26046 report rev: heater bands, size-qty pig cells, polished analyses, Vac deposits collage
Co-Authored-By: Claude Opus 5.5 <noreply@anthropic.com>
</commit_message>
<xml_diff>
--- a/02-facilities/Cenovus/Lima-OH/USA26046-Cenovus-Lima-Job-Report.docx
+++ b/02-facilities/Cenovus/Lima-OH/USA26046-Cenovus-Lima-Job-Report.docx
@@ -2556,22 +2556,61 @@
     </w:p>
     <w:p>
       <w:pPr>
-        <w:spacing w:before="120" w:after="60"/>
         <w:keepNext/>
-        <w:pBdr>
-          <w:bottom w:val="single" w:sz="18" w:space="4" w:color="FCC30A"/>
-        </w:pBdr>
+        <w:spacing w:before="0" w:after="0" w:line="80" w:lineRule="exact"/>
       </w:pPr>
-      <w:r>
-        <w:rPr>
-          <w:rFonts w:ascii="Arial" w:hAnsi="Arial"/>
-          <w:b/>
-          <w:color w:val="222222"/>
-          <w:sz w:val="26"/>
-        </w:rPr>
-        <w:t>PR-170028  —  Crude Furnace</w:t>
-      </w:r>
     </w:p>
+    <w:tbl>
+      <w:tblPr>
+        <w:tblW w:type="auto" w:w="0"/>
+        <w:tblLook w:firstColumn="1" w:firstRow="1" w:lastColumn="0" w:lastRow="0" w:noHBand="0" w:noVBand="1" w:val="04A0"/>
+        <w:tblLayout w:type="fixed"/>
+        <w:tblBorders>
+          <w:top w:val="single" w:sz="4" w:space="0" w:color="222222"/>
+          <w:left w:val="single" w:sz="4" w:space="0" w:color="222222"/>
+          <w:bottom w:val="single" w:sz="4" w:space="0" w:color="222222"/>
+          <w:right w:val="single" w:sz="4" w:space="0" w:color="222222"/>
+          <w:insideH w:val="single" w:sz="4" w:space="0" w:color="222222"/>
+          <w:insideV w:val="single" w:sz="4" w:space="0" w:color="222222"/>
+        </w:tblBorders>
+        <w:tblCellMar>
+          <w:top w:w="8" w:type="dxa"/>
+          <w:bottom w:w="8" w:type="dxa"/>
+          <w:left w:w="60" w:type="dxa"/>
+          <w:right w:w="60" w:type="dxa"/>
+        </w:tblCellMar>
+      </w:tblPr>
+      <w:tblGrid>
+        <w:gridCol w:w="9936"/>
+      </w:tblGrid>
+      <w:tr>
+        <w:tc>
+          <w:tcPr>
+            <w:tcW w:type="dxa" w:w="9936"/>
+            <w:shd w:val="clear" w:fill="222222"/>
+            <w:tcBorders>
+              <w:bottom w:val="single" w:sz="18" w:space="0" w:color="FCC30A"/>
+            </w:tcBorders>
+          </w:tcPr>
+          <w:p>
+            <w:pPr>
+              <w:keepNext/>
+              <w:spacing w:before="20" w:after="20" w:line="240" w:lineRule="auto"/>
+            </w:pPr>
+            <w:r/>
+            <w:r>
+              <w:rPr>
+                <w:rFonts w:ascii="Arial" w:hAnsi="Arial"/>
+                <w:b/>
+                <w:color w:val="FFFFFF"/>
+                <w:sz w:val="24"/>
+              </w:rPr>
+              <w:t>PR-170028  —  Crude Furnace</w:t>
+            </w:r>
+          </w:p>
+        </w:tc>
+      </w:tr>
+    </w:tbl>
     <w:tbl>
       <w:tblPr>
         <w:tblW w:type="auto" w:w="0"/>
@@ -2929,7 +2968,7 @@
           <w:color w:val="555555"/>
           <w:sz w:val="20"/>
         </w:rPr>
-        <w:t>Most of the fouling was in the upper 8" radiant tubes, tubes 1 through 5. Average pigging time was about 39 hours per pass.</w:t>
+        <w:t>Fouling was concentrated in the upper 8" radiant tubes, tubes 1 through 5, with lighter fouling through the balance of the coil. Average pigging time was approximately 39 hours per pass.</w:t>
       </w:r>
     </w:p>
     <w:p>
@@ -2941,7 +2980,7 @@
       <w:r>
         <w:drawing>
           <wp:inline xmlns:a="http://schemas.openxmlformats.org/drawingml/2006/main" xmlns:pic="http://schemas.openxmlformats.org/drawingml/2006/picture">
-            <wp:extent cx="6309360" cy="2504027"/>
+            <wp:extent cx="5852160" cy="1883664"/>
             <wp:docPr id="1" name="Picture 1"/>
             <wp:cNvGraphicFramePr>
               <a:graphicFrameLocks noChangeAspect="1"/>
@@ -2962,7 +3001,7 @@
                   <pic:spPr>
                     <a:xfrm>
                       <a:off x="0" y="0"/>
-                      <a:ext cx="6309360" cy="2504027"/>
+                      <a:ext cx="5852160" cy="1883664"/>
                     </a:xfrm>
                     <a:prstGeom prst="rect"/>
                   </pic:spPr>
@@ -3024,15 +3063,15 @@
         </w:tblCellMar>
       </w:tblPr>
       <w:tblGrid>
-        <w:gridCol w:w="2015"/>
-        <w:gridCol w:w="2639"/>
-        <w:gridCol w:w="2639"/>
-        <w:gridCol w:w="2639"/>
+        <w:gridCol w:w="2484"/>
+        <w:gridCol w:w="2484"/>
+        <w:gridCol w:w="2484"/>
+        <w:gridCol w:w="2484"/>
       </w:tblGrid>
       <w:tr>
         <w:tc>
           <w:tcPr>
-            <w:tcW w:type="dxa" w:w="2016"/>
+            <w:tcW w:type="dxa" w:w="2484"/>
             <w:shd w:val="clear" w:fill="222222"/>
           </w:tcPr>
           <w:p>
@@ -3048,13 +3087,13 @@
                 <w:color w:val="FFFFFF"/>
                 <w:sz w:val="16"/>
               </w:rPr>
-              <w:t>SIZE</w:t>
+              <w:t>SIZE — QTY</w:t>
             </w:r>
           </w:p>
         </w:tc>
         <w:tc>
           <w:tcPr>
-            <w:tcW w:type="dxa" w:w="2640"/>
+            <w:tcW w:type="dxa" w:w="2484"/>
             <w:shd w:val="clear" w:fill="222222"/>
           </w:tcPr>
           <w:p>
@@ -3070,13 +3109,13 @@
                 <w:color w:val="FFFFFF"/>
                 <w:sz w:val="16"/>
               </w:rPr>
-              <w:t>QTY</w:t>
+              <w:t>SIZE — QTY</w:t>
             </w:r>
           </w:p>
         </w:tc>
         <w:tc>
           <w:tcPr>
-            <w:tcW w:type="dxa" w:w="2640"/>
+            <w:tcW w:type="dxa" w:w="2484"/>
             <w:shd w:val="clear" w:fill="222222"/>
           </w:tcPr>
           <w:p>
@@ -3092,13 +3131,13 @@
                 <w:color w:val="FFFFFF"/>
                 <w:sz w:val="16"/>
               </w:rPr>
-              <w:t>SIZE</w:t>
+              <w:t>SIZE — QTY</w:t>
             </w:r>
           </w:p>
         </w:tc>
         <w:tc>
           <w:tcPr>
-            <w:tcW w:type="dxa" w:w="2640"/>
+            <w:tcW w:type="dxa" w:w="2484"/>
             <w:shd w:val="clear" w:fill="222222"/>
           </w:tcPr>
           <w:p>
@@ -3114,7 +3153,7 @@
                 <w:color w:val="FFFFFF"/>
                 <w:sz w:val="16"/>
               </w:rPr>
-              <w:t>QTY</w:t>
+              <w:t>SIZE — QTY</w:t>
             </w:r>
           </w:p>
         </w:tc>
@@ -3122,7 +3161,7 @@
       <w:tr>
         <w:tc>
           <w:tcPr>
-            <w:tcW w:type="dxa" w:w="2016"/>
+            <w:tcW w:type="dxa" w:w="2484"/>
           </w:tcPr>
           <w:p>
             <w:pPr>
@@ -3135,37 +3174,15 @@
                 <w:rFonts w:ascii="Arial" w:hAnsi="Arial"/>
                 <w:b w:val="0"/>
                 <w:color w:val="555555"/>
-                <w:sz w:val="16"/>
+                <w:sz w:val="17"/>
               </w:rPr>
-              <w:t>6"</w:t>
+              <w:t>6"  —  30</w:t>
             </w:r>
           </w:p>
         </w:tc>
         <w:tc>
           <w:tcPr>
-            <w:tcW w:type="dxa" w:w="2640"/>
-          </w:tcPr>
-          <w:p>
-            <w:pPr>
-              <w:keepNext/>
-              <w:spacing w:before="20" w:after="20" w:line="240" w:lineRule="auto"/>
-              <w:jc w:val="center"/>
-            </w:pPr>
-            <w:r/>
-            <w:r>
-              <w:rPr>
-                <w:rFonts w:ascii="Arial" w:hAnsi="Arial"/>
-                <w:b w:val="0"/>
-                <w:color w:val="555555"/>
-                <w:sz w:val="16"/>
-              </w:rPr>
-              <w:t>30</w:t>
-            </w:r>
-          </w:p>
-        </w:tc>
-        <w:tc>
-          <w:tcPr>
-            <w:tcW w:type="dxa" w:w="2640"/>
+            <w:tcW w:type="dxa" w:w="2484"/>
           </w:tcPr>
           <w:p>
             <w:pPr>
@@ -3178,21 +3195,20 @@
                 <w:rFonts w:ascii="Arial" w:hAnsi="Arial"/>
                 <w:b w:val="0"/>
                 <w:color w:val="555555"/>
-                <w:sz w:val="16"/>
+                <w:sz w:val="17"/>
               </w:rPr>
-              <w:t>8"</w:t>
+              <w:t>6.25"  —  50</w:t>
             </w:r>
           </w:p>
         </w:tc>
         <w:tc>
           <w:tcPr>
-            <w:tcW w:type="dxa" w:w="2640"/>
+            <w:tcW w:type="dxa" w:w="2484"/>
           </w:tcPr>
           <w:p>
             <w:pPr>
               <w:keepNext/>
               <w:spacing w:before="20" w:after="20" w:line="240" w:lineRule="auto"/>
-              <w:jc w:val="center"/>
             </w:pPr>
             <w:r/>
             <w:r>
@@ -3200,9 +3216,30 @@
                 <w:rFonts w:ascii="Arial" w:hAnsi="Arial"/>
                 <w:b w:val="0"/>
                 <w:color w:val="555555"/>
-                <w:sz w:val="16"/>
+                <w:sz w:val="17"/>
               </w:rPr>
-              <w:t>40</w:t>
+              <w:t>8"  —  40</w:t>
+            </w:r>
+          </w:p>
+        </w:tc>
+        <w:tc>
+          <w:tcPr>
+            <w:tcW w:type="dxa" w:w="2484"/>
+          </w:tcPr>
+          <w:p>
+            <w:pPr>
+              <w:keepNext/>
+              <w:spacing w:before="20" w:after="20" w:line="240" w:lineRule="auto"/>
+            </w:pPr>
+            <w:r/>
+            <w:r>
+              <w:rPr>
+                <w:rFonts w:ascii="Arial" w:hAnsi="Arial"/>
+                <w:b w:val="0"/>
+                <w:color w:val="555555"/>
+                <w:sz w:val="17"/>
+              </w:rPr>
+              <w:t>8.5"  —  12</w:t>
             </w:r>
           </w:p>
         </w:tc>
@@ -3210,7 +3247,7 @@
       <w:tr>
         <w:tc>
           <w:tcPr>
-            <w:tcW w:type="dxa" w:w="2016"/>
+            <w:tcW w:type="dxa" w:w="2484"/>
             <w:shd w:val="clear" w:fill="F7F7F7"/>
           </w:tcPr>
           <w:p>
@@ -3224,38 +3261,15 @@
                 <w:rFonts w:ascii="Arial" w:hAnsi="Arial"/>
                 <w:b w:val="0"/>
                 <w:color w:val="555555"/>
-                <w:sz w:val="16"/>
+                <w:sz w:val="17"/>
               </w:rPr>
-              <w:t>6.125"</w:t>
+              <w:t>6.125"  —  12</w:t>
             </w:r>
           </w:p>
         </w:tc>
         <w:tc>
           <w:tcPr>
-            <w:tcW w:type="dxa" w:w="2640"/>
-            <w:shd w:val="clear" w:fill="F7F7F7"/>
-          </w:tcPr>
-          <w:p>
-            <w:pPr>
-              <w:keepNext/>
-              <w:spacing w:before="20" w:after="20" w:line="240" w:lineRule="auto"/>
-              <w:jc w:val="center"/>
-            </w:pPr>
-            <w:r/>
-            <w:r>
-              <w:rPr>
-                <w:rFonts w:ascii="Arial" w:hAnsi="Arial"/>
-                <w:b w:val="0"/>
-                <w:color w:val="555555"/>
-                <w:sz w:val="16"/>
-              </w:rPr>
-              <w:t>12</w:t>
-            </w:r>
-          </w:p>
-        </w:tc>
-        <w:tc>
-          <w:tcPr>
-            <w:tcW w:type="dxa" w:w="2640"/>
+            <w:tcW w:type="dxa" w:w="2484"/>
             <w:shd w:val="clear" w:fill="F7F7F7"/>
           </w:tcPr>
           <w:p>
@@ -3269,128 +3283,15 @@
                 <w:rFonts w:ascii="Arial" w:hAnsi="Arial"/>
                 <w:b w:val="0"/>
                 <w:color w:val="555555"/>
-                <w:sz w:val="16"/>
+                <w:sz w:val="17"/>
               </w:rPr>
-              <w:t>8.25"</w:t>
+              <w:t>7.75"  —  3</w:t>
             </w:r>
           </w:p>
         </w:tc>
         <w:tc>
           <w:tcPr>
-            <w:tcW w:type="dxa" w:w="2640"/>
-            <w:shd w:val="clear" w:fill="F7F7F7"/>
-          </w:tcPr>
-          <w:p>
-            <w:pPr>
-              <w:keepNext/>
-              <w:spacing w:before="20" w:after="20" w:line="240" w:lineRule="auto"/>
-              <w:jc w:val="center"/>
-            </w:pPr>
-            <w:r/>
-            <w:r>
-              <w:rPr>
-                <w:rFonts w:ascii="Arial" w:hAnsi="Arial"/>
-                <w:b w:val="0"/>
-                <w:color w:val="555555"/>
-                <w:sz w:val="16"/>
-              </w:rPr>
-              <w:t>54</w:t>
-            </w:r>
-          </w:p>
-        </w:tc>
-      </w:tr>
-      <w:tr>
-        <w:tc>
-          <w:tcPr>
-            <w:tcW w:type="dxa" w:w="2016"/>
-          </w:tcPr>
-          <w:p>
-            <w:pPr>
-              <w:keepNext/>
-              <w:spacing w:before="20" w:after="20" w:line="240" w:lineRule="auto"/>
-            </w:pPr>
-            <w:r/>
-            <w:r>
-              <w:rPr>
-                <w:rFonts w:ascii="Arial" w:hAnsi="Arial"/>
-                <w:b w:val="0"/>
-                <w:color w:val="555555"/>
-                <w:sz w:val="16"/>
-              </w:rPr>
-              <w:t>6.25"</w:t>
-            </w:r>
-          </w:p>
-        </w:tc>
-        <w:tc>
-          <w:tcPr>
-            <w:tcW w:type="dxa" w:w="2640"/>
-          </w:tcPr>
-          <w:p>
-            <w:pPr>
-              <w:keepNext/>
-              <w:spacing w:before="20" w:after="20" w:line="240" w:lineRule="auto"/>
-              <w:jc w:val="center"/>
-            </w:pPr>
-            <w:r/>
-            <w:r>
-              <w:rPr>
-                <w:rFonts w:ascii="Arial" w:hAnsi="Arial"/>
-                <w:b w:val="0"/>
-                <w:color w:val="555555"/>
-                <w:sz w:val="16"/>
-              </w:rPr>
-              <w:t>50</w:t>
-            </w:r>
-          </w:p>
-        </w:tc>
-        <w:tc>
-          <w:tcPr>
-            <w:tcW w:type="dxa" w:w="2640"/>
-          </w:tcPr>
-          <w:p>
-            <w:pPr>
-              <w:keepNext/>
-              <w:spacing w:before="20" w:after="20" w:line="240" w:lineRule="auto"/>
-            </w:pPr>
-            <w:r/>
-            <w:r>
-              <w:rPr>
-                <w:rFonts w:ascii="Arial" w:hAnsi="Arial"/>
-                <w:b w:val="0"/>
-                <w:color w:val="555555"/>
-                <w:sz w:val="16"/>
-              </w:rPr>
-              <w:t>8.5"</w:t>
-            </w:r>
-          </w:p>
-        </w:tc>
-        <w:tc>
-          <w:tcPr>
-            <w:tcW w:type="dxa" w:w="2640"/>
-          </w:tcPr>
-          <w:p>
-            <w:pPr>
-              <w:keepNext/>
-              <w:spacing w:before="20" w:after="20" w:line="240" w:lineRule="auto"/>
-              <w:jc w:val="center"/>
-            </w:pPr>
-            <w:r/>
-            <w:r>
-              <w:rPr>
-                <w:rFonts w:ascii="Arial" w:hAnsi="Arial"/>
-                <w:b w:val="0"/>
-                <w:color w:val="555555"/>
-                <w:sz w:val="16"/>
-              </w:rPr>
-              <w:t>12</w:t>
-            </w:r>
-          </w:p>
-        </w:tc>
-      </w:tr>
-      <w:tr>
-        <w:tc>
-          <w:tcPr>
-            <w:tcW w:type="dxa" w:w="2016"/>
+            <w:tcW w:type="dxa" w:w="2484"/>
             <w:shd w:val="clear" w:fill="F7F7F7"/>
           </w:tcPr>
           <w:p>
@@ -3404,38 +3305,15 @@
                 <w:rFonts w:ascii="Arial" w:hAnsi="Arial"/>
                 <w:b w:val="0"/>
                 <w:color w:val="555555"/>
-                <w:sz w:val="16"/>
+                <w:sz w:val="17"/>
               </w:rPr>
-              <w:t>7.75"</w:t>
+              <w:t>8.25"  —  54</w:t>
             </w:r>
           </w:p>
         </w:tc>
         <w:tc>
           <w:tcPr>
-            <w:tcW w:type="dxa" w:w="2640"/>
-            <w:shd w:val="clear" w:fill="F7F7F7"/>
-          </w:tcPr>
-          <w:p>
-            <w:pPr>
-              <w:keepNext/>
-              <w:spacing w:before="20" w:after="20" w:line="240" w:lineRule="auto"/>
-              <w:jc w:val="center"/>
-            </w:pPr>
-            <w:r/>
-            <w:r>
-              <w:rPr>
-                <w:rFonts w:ascii="Arial" w:hAnsi="Arial"/>
-                <w:b w:val="0"/>
-                <w:color w:val="555555"/>
-                <w:sz w:val="16"/>
-              </w:rPr>
-              <w:t>3</w:t>
-            </w:r>
-          </w:p>
-        </w:tc>
-        <w:tc>
-          <w:tcPr>
-            <w:tcW w:type="dxa" w:w="2640"/>
+            <w:tcW w:type="dxa" w:w="2484"/>
             <w:shd w:val="clear" w:fill="F7F7F7"/>
           </w:tcPr>
           <w:p>
@@ -3449,29 +3327,7 @@
                 <w:rFonts w:ascii="Arial" w:hAnsi="Arial"/>
                 <w:b w:val="0"/>
                 <w:color w:val="555555"/>
-                <w:sz w:val="16"/>
-              </w:rPr>
-            </w:r>
-          </w:p>
-        </w:tc>
-        <w:tc>
-          <w:tcPr>
-            <w:tcW w:type="dxa" w:w="2640"/>
-            <w:shd w:val="clear" w:fill="F7F7F7"/>
-          </w:tcPr>
-          <w:p>
-            <w:pPr>
-              <w:keepNext/>
-              <w:spacing w:before="20" w:after="20" w:line="240" w:lineRule="auto"/>
-              <w:jc w:val="center"/>
-            </w:pPr>
-            <w:r/>
-            <w:r>
-              <w:rPr>
-                <w:rFonts w:ascii="Arial" w:hAnsi="Arial"/>
-                <w:b w:val="0"/>
-                <w:color w:val="555555"/>
-                <w:sz w:val="16"/>
+                <w:sz w:val="17"/>
               </w:rPr>
             </w:r>
           </w:p>
@@ -3480,7 +3336,7 @@
       <w:tr>
         <w:tc>
           <w:tcPr>
-            <w:tcW w:type="dxa" w:w="2016"/>
+            <w:tcW w:type="dxa" w:w="2484"/>
             <w:shd w:val="clear" w:fill="F7F7F7"/>
           </w:tcPr>
           <w:p>
@@ -3493,37 +3349,15 @@
                 <w:rFonts w:ascii="Arial" w:hAnsi="Arial"/>
                 <w:b/>
                 <w:color w:val="222222"/>
-                <w:sz w:val="16"/>
+                <w:sz w:val="17"/>
               </w:rPr>
-              <w:t>TOTAL</w:t>
+              <w:t>TOTAL  —  201</w:t>
             </w:r>
           </w:p>
         </w:tc>
         <w:tc>
           <w:tcPr>
-            <w:tcW w:type="dxa" w:w="2640"/>
-            <w:shd w:val="clear" w:fill="F7F7F7"/>
-          </w:tcPr>
-          <w:p>
-            <w:pPr>
-              <w:spacing w:before="20" w:after="20" w:line="240" w:lineRule="auto"/>
-              <w:jc w:val="center"/>
-            </w:pPr>
-            <w:r/>
-            <w:r>
-              <w:rPr>
-                <w:rFonts w:ascii="Arial" w:hAnsi="Arial"/>
-                <w:b/>
-                <w:color w:val="222222"/>
-                <w:sz w:val="16"/>
-              </w:rPr>
-              <w:t>201</w:t>
-            </w:r>
-          </w:p>
-        </w:tc>
-        <w:tc>
-          <w:tcPr>
-            <w:tcW w:type="dxa" w:w="2640"/>
+            <w:tcW w:type="dxa" w:w="2484"/>
             <w:shd w:val="clear" w:fill="F7F7F7"/>
           </w:tcPr>
           <w:p>
@@ -3543,7 +3377,27 @@
         </w:tc>
         <w:tc>
           <w:tcPr>
-            <w:tcW w:type="dxa" w:w="2640"/>
+            <w:tcW w:type="dxa" w:w="2484"/>
+            <w:shd w:val="clear" w:fill="F7F7F7"/>
+          </w:tcPr>
+          <w:p>
+            <w:pPr>
+              <w:spacing w:before="20" w:after="20" w:line="240" w:lineRule="auto"/>
+            </w:pPr>
+            <w:r/>
+            <w:r>
+              <w:rPr>
+                <w:rFonts w:ascii="Arial" w:hAnsi="Arial"/>
+                <w:b w:val="0"/>
+                <w:color w:val="555555"/>
+                <w:sz w:val="16"/>
+              </w:rPr>
+            </w:r>
+          </w:p>
+        </w:tc>
+        <w:tc>
+          <w:tcPr>
+            <w:tcW w:type="dxa" w:w="2484"/>
             <w:shd w:val="clear" w:fill="F7F7F7"/>
           </w:tcPr>
           <w:p>
@@ -6882,22 +6736,61 @@
     </w:tbl>
     <w:p>
       <w:pPr>
-        <w:spacing w:before="120" w:after="60"/>
         <w:keepNext/>
-        <w:pBdr>
-          <w:bottom w:val="single" w:sz="18" w:space="4" w:color="FCC30A"/>
-        </w:pBdr>
+        <w:spacing w:before="0" w:after="0" w:line="320" w:lineRule="exact"/>
       </w:pPr>
-      <w:r>
-        <w:rPr>
-          <w:rFonts w:ascii="Arial" w:hAnsi="Arial"/>
-          <w:b/>
-          <w:color w:val="222222"/>
-          <w:sz w:val="26"/>
-        </w:rPr>
-        <w:t>PR-170029  —  Vacuum Charge Furnace</w:t>
-      </w:r>
     </w:p>
+    <w:tbl>
+      <w:tblPr>
+        <w:tblW w:type="auto" w:w="0"/>
+        <w:tblLook w:firstColumn="1" w:firstRow="1" w:lastColumn="0" w:lastRow="0" w:noHBand="0" w:noVBand="1" w:val="04A0"/>
+        <w:tblLayout w:type="fixed"/>
+        <w:tblBorders>
+          <w:top w:val="single" w:sz="4" w:space="0" w:color="222222"/>
+          <w:left w:val="single" w:sz="4" w:space="0" w:color="222222"/>
+          <w:bottom w:val="single" w:sz="4" w:space="0" w:color="222222"/>
+          <w:right w:val="single" w:sz="4" w:space="0" w:color="222222"/>
+          <w:insideH w:val="single" w:sz="4" w:space="0" w:color="222222"/>
+          <w:insideV w:val="single" w:sz="4" w:space="0" w:color="222222"/>
+        </w:tblBorders>
+        <w:tblCellMar>
+          <w:top w:w="8" w:type="dxa"/>
+          <w:bottom w:w="8" w:type="dxa"/>
+          <w:left w:w="60" w:type="dxa"/>
+          <w:right w:w="60" w:type="dxa"/>
+        </w:tblCellMar>
+      </w:tblPr>
+      <w:tblGrid>
+        <w:gridCol w:w="9936"/>
+      </w:tblGrid>
+      <w:tr>
+        <w:tc>
+          <w:tcPr>
+            <w:tcW w:type="dxa" w:w="9936"/>
+            <w:shd w:val="clear" w:fill="222222"/>
+            <w:tcBorders>
+              <w:bottom w:val="single" w:sz="18" w:space="0" w:color="FCC30A"/>
+            </w:tcBorders>
+          </w:tcPr>
+          <w:p>
+            <w:pPr>
+              <w:keepNext/>
+              <w:spacing w:before="20" w:after="20" w:line="240" w:lineRule="auto"/>
+            </w:pPr>
+            <w:r/>
+            <w:r>
+              <w:rPr>
+                <w:rFonts w:ascii="Arial" w:hAnsi="Arial"/>
+                <w:b/>
+                <w:color w:val="FFFFFF"/>
+                <w:sz w:val="24"/>
+              </w:rPr>
+              <w:t>PR-170029  —  Vacuum Charge Furnace</w:t>
+            </w:r>
+          </w:p>
+        </w:tc>
+      </w:tr>
+    </w:tbl>
     <w:tbl>
       <w:tblPr>
         <w:tblW w:type="auto" w:w="0"/>
@@ -7255,7 +7148,7 @@
           <w:color w:val="555555"/>
           <w:sz w:val="20"/>
         </w:rPr>
-        <w:t>Passes 4 and 5 were the dirtiest, pass 5 the most. Pass 5 had heavy fouling in the 12", moderate in the 10" and 4", and light in the 6" and 8". Pass 4 had moderate fouling in the 12", light to moderate in the 10", and light in the 8", 6" and 4". The other six passes were light throughout. The external 6" convection inlet piping, from the control valve to the 4" convection inlet tube, was heavily fouled on all eight passes, enough to stop 4" pigs entering the convection; it was cleaned first on every pass. Average pigging time was about 21 hours per pass.</w:t>
+        <w:t>Passes 4 and 5 carried the heaviest fouling, pass 5 the most. In pass 5, fouling was heavy in the 12" section, moderate in the 10" and 4" sections, and light in the 6" and 8" sections. In pass 4, it was moderate in the 12", light to moderate in the 10", and light in the 8", 6" and 4" sections. The remaining six passes showed light fouling throughout. The external 6" convection inlet piping, between the control valve and the 4" convection inlet tube, was heavily fouled on all eight passes, enough to keep 4" pigs from entering the convection section, and was cleaned first on each pass. Average pigging time was approximately 21 hours per pass.</w:t>
       </w:r>
     </w:p>
     <w:p>
@@ -7311,7 +7204,7 @@
           <w:color w:val="888888"/>
           <w:sz w:val="16"/>
         </w:rPr>
-        <w:t>Radiant outlet flanges, viewed facing the outlets. Each number is the pass, and the outlet belongs to the convection inlet of the same pass.</w:t>
+        <w:t>Radiant outlet flanges, viewed facing the outlets.</w:t>
       </w:r>
     </w:p>
     <w:tbl>
@@ -7350,7 +7243,7 @@
                 <w:color w:val="555555"/>
                 <w:sz w:val="18"/>
               </w:rPr>
-              <w:t>The chalk marks on the radiant outlet flanges and the flange tags were mislabelled. Use the layout above to match each radiant outlet to its convection inlet.</w:t>
+              <w:t>The layout above illustrates the correct radiant outlet labels and orientation. Each outlet connects to the convection inlet of the same pass number.</w:t>
             </w:r>
           </w:p>
         </w:tc>
@@ -7365,7 +7258,7 @@
       <w:r>
         <w:drawing>
           <wp:inline xmlns:a="http://schemas.openxmlformats.org/drawingml/2006/main" xmlns:pic="http://schemas.openxmlformats.org/drawingml/2006/picture">
-            <wp:extent cx="6309360" cy="3144822"/>
+            <wp:extent cx="5852160" cy="2340864"/>
             <wp:docPr id="3" name="Picture 3"/>
             <wp:cNvGraphicFramePr>
               <a:graphicFrameLocks noChangeAspect="1"/>
@@ -7386,7 +7279,7 @@
                   <pic:spPr>
                     <a:xfrm>
                       <a:off x="0" y="0"/>
-                      <a:ext cx="6309360" cy="3144822"/>
+                      <a:ext cx="5852160" cy="2340864"/>
                     </a:xfrm>
                     <a:prstGeom prst="rect"/>
                   </pic:spPr>
@@ -7448,15 +7341,15 @@
         </w:tblCellMar>
       </w:tblPr>
       <w:tblGrid>
-        <w:gridCol w:w="2015"/>
-        <w:gridCol w:w="2639"/>
-        <w:gridCol w:w="2639"/>
-        <w:gridCol w:w="2639"/>
+        <w:gridCol w:w="2484"/>
+        <w:gridCol w:w="2484"/>
+        <w:gridCol w:w="2484"/>
+        <w:gridCol w:w="2484"/>
       </w:tblGrid>
       <w:tr>
         <w:tc>
           <w:tcPr>
-            <w:tcW w:type="dxa" w:w="2016"/>
+            <w:tcW w:type="dxa" w:w="2484"/>
             <w:shd w:val="clear" w:fill="222222"/>
           </w:tcPr>
           <w:p>
@@ -7472,13 +7365,13 @@
                 <w:color w:val="FFFFFF"/>
                 <w:sz w:val="16"/>
               </w:rPr>
-              <w:t>SIZE</w:t>
+              <w:t>SIZE — QTY</w:t>
             </w:r>
           </w:p>
         </w:tc>
         <w:tc>
           <w:tcPr>
-            <w:tcW w:type="dxa" w:w="2640"/>
+            <w:tcW w:type="dxa" w:w="2484"/>
             <w:shd w:val="clear" w:fill="222222"/>
           </w:tcPr>
           <w:p>
@@ -7494,13 +7387,13 @@
                 <w:color w:val="FFFFFF"/>
                 <w:sz w:val="16"/>
               </w:rPr>
-              <w:t>QTY</w:t>
+              <w:t>SIZE — QTY</w:t>
             </w:r>
           </w:p>
         </w:tc>
         <w:tc>
           <w:tcPr>
-            <w:tcW w:type="dxa" w:w="2640"/>
+            <w:tcW w:type="dxa" w:w="2484"/>
             <w:shd w:val="clear" w:fill="222222"/>
           </w:tcPr>
           <w:p>
@@ -7516,13 +7409,13 @@
                 <w:color w:val="FFFFFF"/>
                 <w:sz w:val="16"/>
               </w:rPr>
-              <w:t>SIZE</w:t>
+              <w:t>SIZE — QTY</w:t>
             </w:r>
           </w:p>
         </w:tc>
         <w:tc>
           <w:tcPr>
-            <w:tcW w:type="dxa" w:w="2640"/>
+            <w:tcW w:type="dxa" w:w="2484"/>
             <w:shd w:val="clear" w:fill="222222"/>
           </w:tcPr>
           <w:p>
@@ -7538,7 +7431,7 @@
                 <w:color w:val="FFFFFF"/>
                 <w:sz w:val="16"/>
               </w:rPr>
-              <w:t>QTY</w:t>
+              <w:t>SIZE — QTY</w:t>
             </w:r>
           </w:p>
         </w:tc>
@@ -7546,7 +7439,7 @@
       <w:tr>
         <w:tc>
           <w:tcPr>
-            <w:tcW w:type="dxa" w:w="2016"/>
+            <w:tcW w:type="dxa" w:w="2484"/>
           </w:tcPr>
           <w:p>
             <w:pPr>
@@ -7559,37 +7452,15 @@
                 <w:rFonts w:ascii="Arial" w:hAnsi="Arial"/>
                 <w:b w:val="0"/>
                 <w:color w:val="555555"/>
-                <w:sz w:val="16"/>
+                <w:sz w:val="17"/>
               </w:rPr>
-              <w:t>3.75"</w:t>
+              <w:t>3.75"  —  4</w:t>
             </w:r>
           </w:p>
         </w:tc>
         <w:tc>
           <w:tcPr>
-            <w:tcW w:type="dxa" w:w="2640"/>
-          </w:tcPr>
-          <w:p>
-            <w:pPr>
-              <w:keepNext/>
-              <w:spacing w:before="20" w:after="20" w:line="240" w:lineRule="auto"/>
-              <w:jc w:val="center"/>
-            </w:pPr>
-            <w:r/>
-            <w:r>
-              <w:rPr>
-                <w:rFonts w:ascii="Arial" w:hAnsi="Arial"/>
-                <w:b w:val="0"/>
-                <w:color w:val="555555"/>
-                <w:sz w:val="16"/>
-              </w:rPr>
-              <w:t>4</w:t>
-            </w:r>
-          </w:p>
-        </w:tc>
-        <w:tc>
-          <w:tcPr>
-            <w:tcW w:type="dxa" w:w="2640"/>
+            <w:tcW w:type="dxa" w:w="2484"/>
           </w:tcPr>
           <w:p>
             <w:pPr>
@@ -7602,21 +7473,20 @@
                 <w:rFonts w:ascii="Arial" w:hAnsi="Arial"/>
                 <w:b w:val="0"/>
                 <w:color w:val="555555"/>
-                <w:sz w:val="16"/>
+                <w:sz w:val="17"/>
               </w:rPr>
-              <w:t>6.25"</w:t>
+              <w:t>4.125"  —  15</w:t>
             </w:r>
           </w:p>
         </w:tc>
         <w:tc>
           <w:tcPr>
-            <w:tcW w:type="dxa" w:w="2640"/>
+            <w:tcW w:type="dxa" w:w="2484"/>
           </w:tcPr>
           <w:p>
             <w:pPr>
               <w:keepNext/>
               <w:spacing w:before="20" w:after="20" w:line="240" w:lineRule="auto"/>
-              <w:jc w:val="center"/>
             </w:pPr>
             <w:r/>
             <w:r>
@@ -7624,9 +7494,30 @@
                 <w:rFonts w:ascii="Arial" w:hAnsi="Arial"/>
                 <w:b w:val="0"/>
                 <w:color w:val="555555"/>
-                <w:sz w:val="16"/>
+                <w:sz w:val="17"/>
               </w:rPr>
-              <w:t>6</w:t>
+              <w:t>6.25"  —  6</w:t>
+            </w:r>
+          </w:p>
+        </w:tc>
+        <w:tc>
+          <w:tcPr>
+            <w:tcW w:type="dxa" w:w="2484"/>
+          </w:tcPr>
+          <w:p>
+            <w:pPr>
+              <w:keepNext/>
+              <w:spacing w:before="20" w:after="20" w:line="240" w:lineRule="auto"/>
+            </w:pPr>
+            <w:r/>
+            <w:r>
+              <w:rPr>
+                <w:rFonts w:ascii="Arial" w:hAnsi="Arial"/>
+                <w:b w:val="0"/>
+                <w:color w:val="555555"/>
+                <w:sz w:val="17"/>
+              </w:rPr>
+              <w:t>10"  —  20</w:t>
             </w:r>
           </w:p>
         </w:tc>
@@ -7634,7 +7525,7 @@
       <w:tr>
         <w:tc>
           <w:tcPr>
-            <w:tcW w:type="dxa" w:w="2016"/>
+            <w:tcW w:type="dxa" w:w="2484"/>
             <w:shd w:val="clear" w:fill="F7F7F7"/>
           </w:tcPr>
           <w:p>
@@ -7648,38 +7539,15 @@
                 <w:rFonts w:ascii="Arial" w:hAnsi="Arial"/>
                 <w:b w:val="0"/>
                 <w:color w:val="555555"/>
-                <w:sz w:val="16"/>
+                <w:sz w:val="17"/>
               </w:rPr>
-              <w:t>3.8"</w:t>
+              <w:t>3.8"  —  1</w:t>
             </w:r>
           </w:p>
         </w:tc>
         <w:tc>
           <w:tcPr>
-            <w:tcW w:type="dxa" w:w="2640"/>
-            <w:shd w:val="clear" w:fill="F7F7F7"/>
-          </w:tcPr>
-          <w:p>
-            <w:pPr>
-              <w:keepNext/>
-              <w:spacing w:before="20" w:after="20" w:line="240" w:lineRule="auto"/>
-              <w:jc w:val="center"/>
-            </w:pPr>
-            <w:r/>
-            <w:r>
-              <w:rPr>
-                <w:rFonts w:ascii="Arial" w:hAnsi="Arial"/>
-                <w:b w:val="0"/>
-                <w:color w:val="555555"/>
-                <w:sz w:val="16"/>
-              </w:rPr>
-              <w:t>1</w:t>
-            </w:r>
-          </w:p>
-        </w:tc>
-        <w:tc>
-          <w:tcPr>
-            <w:tcW w:type="dxa" w:w="2640"/>
+            <w:tcW w:type="dxa" w:w="2484"/>
             <w:shd w:val="clear" w:fill="F7F7F7"/>
           </w:tcPr>
           <w:p>
@@ -7693,128 +7561,15 @@
                 <w:rFonts w:ascii="Arial" w:hAnsi="Arial"/>
                 <w:b w:val="0"/>
                 <w:color w:val="555555"/>
-                <w:sz w:val="16"/>
+                <w:sz w:val="17"/>
               </w:rPr>
-              <w:t>8"</w:t>
+              <w:t>4.25"  —  4</w:t>
             </w:r>
           </w:p>
         </w:tc>
         <w:tc>
           <w:tcPr>
-            <w:tcW w:type="dxa" w:w="2640"/>
-            <w:shd w:val="clear" w:fill="F7F7F7"/>
-          </w:tcPr>
-          <w:p>
-            <w:pPr>
-              <w:keepNext/>
-              <w:spacing w:before="20" w:after="20" w:line="240" w:lineRule="auto"/>
-              <w:jc w:val="center"/>
-            </w:pPr>
-            <w:r/>
-            <w:r>
-              <w:rPr>
-                <w:rFonts w:ascii="Arial" w:hAnsi="Arial"/>
-                <w:b w:val="0"/>
-                <w:color w:val="555555"/>
-                <w:sz w:val="16"/>
-              </w:rPr>
-              <w:t>7</w:t>
-            </w:r>
-          </w:p>
-        </w:tc>
-      </w:tr>
-      <w:tr>
-        <w:tc>
-          <w:tcPr>
-            <w:tcW w:type="dxa" w:w="2016"/>
-          </w:tcPr>
-          <w:p>
-            <w:pPr>
-              <w:keepNext/>
-              <w:spacing w:before="20" w:after="20" w:line="240" w:lineRule="auto"/>
-            </w:pPr>
-            <w:r/>
-            <w:r>
-              <w:rPr>
-                <w:rFonts w:ascii="Arial" w:hAnsi="Arial"/>
-                <w:b w:val="0"/>
-                <w:color w:val="555555"/>
-                <w:sz w:val="16"/>
-              </w:rPr>
-              <w:t>4"</w:t>
-            </w:r>
-          </w:p>
-        </w:tc>
-        <w:tc>
-          <w:tcPr>
-            <w:tcW w:type="dxa" w:w="2640"/>
-          </w:tcPr>
-          <w:p>
-            <w:pPr>
-              <w:keepNext/>
-              <w:spacing w:before="20" w:after="20" w:line="240" w:lineRule="auto"/>
-              <w:jc w:val="center"/>
-            </w:pPr>
-            <w:r/>
-            <w:r>
-              <w:rPr>
-                <w:rFonts w:ascii="Arial" w:hAnsi="Arial"/>
-                <w:b w:val="0"/>
-                <w:color w:val="555555"/>
-                <w:sz w:val="16"/>
-              </w:rPr>
-              <w:t>22</w:t>
-            </w:r>
-          </w:p>
-        </w:tc>
-        <w:tc>
-          <w:tcPr>
-            <w:tcW w:type="dxa" w:w="2640"/>
-          </w:tcPr>
-          <w:p>
-            <w:pPr>
-              <w:keepNext/>
-              <w:spacing w:before="20" w:after="20" w:line="240" w:lineRule="auto"/>
-            </w:pPr>
-            <w:r/>
-            <w:r>
-              <w:rPr>
-                <w:rFonts w:ascii="Arial" w:hAnsi="Arial"/>
-                <w:b w:val="0"/>
-                <w:color w:val="555555"/>
-                <w:sz w:val="16"/>
-              </w:rPr>
-              <w:t>8.25"</w:t>
-            </w:r>
-          </w:p>
-        </w:tc>
-        <w:tc>
-          <w:tcPr>
-            <w:tcW w:type="dxa" w:w="2640"/>
-          </w:tcPr>
-          <w:p>
-            <w:pPr>
-              <w:keepNext/>
-              <w:spacing w:before="20" w:after="20" w:line="240" w:lineRule="auto"/>
-              <w:jc w:val="center"/>
-            </w:pPr>
-            <w:r/>
-            <w:r>
-              <w:rPr>
-                <w:rFonts w:ascii="Arial" w:hAnsi="Arial"/>
-                <w:b w:val="0"/>
-                <w:color w:val="555555"/>
-                <w:sz w:val="16"/>
-              </w:rPr>
-              <w:t>2</w:t>
-            </w:r>
-          </w:p>
-        </w:tc>
-      </w:tr>
-      <w:tr>
-        <w:tc>
-          <w:tcPr>
-            <w:tcW w:type="dxa" w:w="2016"/>
+            <w:tcW w:type="dxa" w:w="2484"/>
             <w:shd w:val="clear" w:fill="F7F7F7"/>
           </w:tcPr>
           <w:p>
@@ -7828,38 +7583,15 @@
                 <w:rFonts w:ascii="Arial" w:hAnsi="Arial"/>
                 <w:b w:val="0"/>
                 <w:color w:val="555555"/>
-                <w:sz w:val="16"/>
+                <w:sz w:val="17"/>
               </w:rPr>
-              <w:t>4.125"</w:t>
+              <w:t>8"  —  7</w:t>
             </w:r>
           </w:p>
         </w:tc>
         <w:tc>
           <w:tcPr>
-            <w:tcW w:type="dxa" w:w="2640"/>
-            <w:shd w:val="clear" w:fill="F7F7F7"/>
-          </w:tcPr>
-          <w:p>
-            <w:pPr>
-              <w:keepNext/>
-              <w:spacing w:before="20" w:after="20" w:line="240" w:lineRule="auto"/>
-              <w:jc w:val="center"/>
-            </w:pPr>
-            <w:r/>
-            <w:r>
-              <w:rPr>
-                <w:rFonts w:ascii="Arial" w:hAnsi="Arial"/>
-                <w:b w:val="0"/>
-                <w:color w:val="555555"/>
-                <w:sz w:val="16"/>
-              </w:rPr>
-              <w:t>15</w:t>
-            </w:r>
-          </w:p>
-        </w:tc>
-        <w:tc>
-          <w:tcPr>
-            <w:tcW w:type="dxa" w:w="2640"/>
+            <w:tcW w:type="dxa" w:w="2484"/>
             <w:shd w:val="clear" w:fill="F7F7F7"/>
           </w:tcPr>
           <w:p>
@@ -7873,32 +7605,9 @@
                 <w:rFonts w:ascii="Arial" w:hAnsi="Arial"/>
                 <w:b w:val="0"/>
                 <w:color w:val="555555"/>
-                <w:sz w:val="16"/>
+                <w:sz w:val="17"/>
               </w:rPr>
-              <w:t>10"</w:t>
-            </w:r>
-          </w:p>
-        </w:tc>
-        <w:tc>
-          <w:tcPr>
-            <w:tcW w:type="dxa" w:w="2640"/>
-            <w:shd w:val="clear" w:fill="F7F7F7"/>
-          </w:tcPr>
-          <w:p>
-            <w:pPr>
-              <w:keepNext/>
-              <w:spacing w:before="20" w:after="20" w:line="240" w:lineRule="auto"/>
-              <w:jc w:val="center"/>
-            </w:pPr>
-            <w:r/>
-            <w:r>
-              <w:rPr>
-                <w:rFonts w:ascii="Arial" w:hAnsi="Arial"/>
-                <w:b w:val="0"/>
-                <w:color w:val="555555"/>
-                <w:sz w:val="16"/>
-              </w:rPr>
-              <w:t>20</w:t>
+              <w:t>12"  —  6</w:t>
             </w:r>
           </w:p>
         </w:tc>
@@ -7906,7 +7615,7 @@
       <w:tr>
         <w:tc>
           <w:tcPr>
-            <w:tcW w:type="dxa" w:w="2016"/>
+            <w:tcW w:type="dxa" w:w="2484"/>
           </w:tcPr>
           <w:p>
             <w:pPr>
@@ -7919,37 +7628,15 @@
                 <w:rFonts w:ascii="Arial" w:hAnsi="Arial"/>
                 <w:b w:val="0"/>
                 <w:color w:val="555555"/>
-                <w:sz w:val="16"/>
+                <w:sz w:val="17"/>
               </w:rPr>
-              <w:t>4.25"</w:t>
+              <w:t>4"  —  22</w:t>
             </w:r>
           </w:p>
         </w:tc>
         <w:tc>
           <w:tcPr>
-            <w:tcW w:type="dxa" w:w="2640"/>
-          </w:tcPr>
-          <w:p>
-            <w:pPr>
-              <w:keepNext/>
-              <w:spacing w:before="20" w:after="20" w:line="240" w:lineRule="auto"/>
-              <w:jc w:val="center"/>
-            </w:pPr>
-            <w:r/>
-            <w:r>
-              <w:rPr>
-                <w:rFonts w:ascii="Arial" w:hAnsi="Arial"/>
-                <w:b w:val="0"/>
-                <w:color w:val="555555"/>
-                <w:sz w:val="16"/>
-              </w:rPr>
-              <w:t>4</w:t>
-            </w:r>
-          </w:p>
-        </w:tc>
-        <w:tc>
-          <w:tcPr>
-            <w:tcW w:type="dxa" w:w="2640"/>
+            <w:tcW w:type="dxa" w:w="2484"/>
           </w:tcPr>
           <w:p>
             <w:pPr>
@@ -7962,40 +7649,15 @@
                 <w:rFonts w:ascii="Arial" w:hAnsi="Arial"/>
                 <w:b w:val="0"/>
                 <w:color w:val="555555"/>
-                <w:sz w:val="16"/>
+                <w:sz w:val="17"/>
               </w:rPr>
-              <w:t>12"</w:t>
+              <w:t>6"  —  10</w:t>
             </w:r>
           </w:p>
         </w:tc>
         <w:tc>
           <w:tcPr>
-            <w:tcW w:type="dxa" w:w="2640"/>
-          </w:tcPr>
-          <w:p>
-            <w:pPr>
-              <w:keepNext/>
-              <w:spacing w:before="20" w:after="20" w:line="240" w:lineRule="auto"/>
-              <w:jc w:val="center"/>
-            </w:pPr>
-            <w:r/>
-            <w:r>
-              <w:rPr>
-                <w:rFonts w:ascii="Arial" w:hAnsi="Arial"/>
-                <w:b w:val="0"/>
-                <w:color w:val="555555"/>
-                <w:sz w:val="16"/>
-              </w:rPr>
-              <w:t>6</w:t>
-            </w:r>
-          </w:p>
-        </w:tc>
-      </w:tr>
-      <w:tr>
-        <w:tc>
-          <w:tcPr>
-            <w:tcW w:type="dxa" w:w="2016"/>
-            <w:shd w:val="clear" w:fill="F7F7F7"/>
+            <w:tcW w:type="dxa" w:w="2484"/>
           </w:tcPr>
           <w:p>
             <w:pPr>
@@ -8008,39 +7670,15 @@
                 <w:rFonts w:ascii="Arial" w:hAnsi="Arial"/>
                 <w:b w:val="0"/>
                 <w:color w:val="555555"/>
-                <w:sz w:val="16"/>
+                <w:sz w:val="17"/>
               </w:rPr>
-              <w:t>6"</w:t>
+              <w:t>8.25"  —  2</w:t>
             </w:r>
           </w:p>
         </w:tc>
         <w:tc>
           <w:tcPr>
-            <w:tcW w:type="dxa" w:w="2640"/>
-            <w:shd w:val="clear" w:fill="F7F7F7"/>
-          </w:tcPr>
-          <w:p>
-            <w:pPr>
-              <w:keepNext/>
-              <w:spacing w:before="20" w:after="20" w:line="240" w:lineRule="auto"/>
-              <w:jc w:val="center"/>
-            </w:pPr>
-            <w:r/>
-            <w:r>
-              <w:rPr>
-                <w:rFonts w:ascii="Arial" w:hAnsi="Arial"/>
-                <w:b w:val="0"/>
-                <w:color w:val="555555"/>
-                <w:sz w:val="16"/>
-              </w:rPr>
-              <w:t>10</w:t>
-            </w:r>
-          </w:p>
-        </w:tc>
-        <w:tc>
-          <w:tcPr>
-            <w:tcW w:type="dxa" w:w="2640"/>
-            <w:shd w:val="clear" w:fill="F7F7F7"/>
+            <w:tcW w:type="dxa" w:w="2484"/>
           </w:tcPr>
           <w:p>
             <w:pPr>
@@ -8053,29 +7691,7 @@
                 <w:rFonts w:ascii="Arial" w:hAnsi="Arial"/>
                 <w:b w:val="0"/>
                 <w:color w:val="555555"/>
-                <w:sz w:val="16"/>
-              </w:rPr>
-            </w:r>
-          </w:p>
-        </w:tc>
-        <w:tc>
-          <w:tcPr>
-            <w:tcW w:type="dxa" w:w="2640"/>
-            <w:shd w:val="clear" w:fill="F7F7F7"/>
-          </w:tcPr>
-          <w:p>
-            <w:pPr>
-              <w:keepNext/>
-              <w:spacing w:before="20" w:after="20" w:line="240" w:lineRule="auto"/>
-              <w:jc w:val="center"/>
-            </w:pPr>
-            <w:r/>
-            <w:r>
-              <w:rPr>
-                <w:rFonts w:ascii="Arial" w:hAnsi="Arial"/>
-                <w:b w:val="0"/>
-                <w:color w:val="555555"/>
-                <w:sz w:val="16"/>
+                <w:sz w:val="17"/>
               </w:rPr>
             </w:r>
           </w:p>
@@ -8084,7 +7700,7 @@
       <w:tr>
         <w:tc>
           <w:tcPr>
-            <w:tcW w:type="dxa" w:w="2016"/>
+            <w:tcW w:type="dxa" w:w="2484"/>
             <w:shd w:val="clear" w:fill="F7F7F7"/>
           </w:tcPr>
           <w:p>
@@ -8097,37 +7713,15 @@
                 <w:rFonts w:ascii="Arial" w:hAnsi="Arial"/>
                 <w:b/>
                 <w:color w:val="222222"/>
-                <w:sz w:val="16"/>
+                <w:sz w:val="17"/>
               </w:rPr>
-              <w:t>TOTAL</w:t>
+              <w:t>TOTAL  —  97</w:t>
             </w:r>
           </w:p>
         </w:tc>
         <w:tc>
           <w:tcPr>
-            <w:tcW w:type="dxa" w:w="2640"/>
-            <w:shd w:val="clear" w:fill="F7F7F7"/>
-          </w:tcPr>
-          <w:p>
-            <w:pPr>
-              <w:spacing w:before="20" w:after="20" w:line="240" w:lineRule="auto"/>
-              <w:jc w:val="center"/>
-            </w:pPr>
-            <w:r/>
-            <w:r>
-              <w:rPr>
-                <w:rFonts w:ascii="Arial" w:hAnsi="Arial"/>
-                <w:b/>
-                <w:color w:val="222222"/>
-                <w:sz w:val="16"/>
-              </w:rPr>
-              <w:t>97</w:t>
-            </w:r>
-          </w:p>
-        </w:tc>
-        <w:tc>
-          <w:tcPr>
-            <w:tcW w:type="dxa" w:w="2640"/>
+            <w:tcW w:type="dxa" w:w="2484"/>
             <w:shd w:val="clear" w:fill="F7F7F7"/>
           </w:tcPr>
           <w:p>
@@ -8147,7 +7741,27 @@
         </w:tc>
         <w:tc>
           <w:tcPr>
-            <w:tcW w:type="dxa" w:w="2640"/>
+            <w:tcW w:type="dxa" w:w="2484"/>
+            <w:shd w:val="clear" w:fill="F7F7F7"/>
+          </w:tcPr>
+          <w:p>
+            <w:pPr>
+              <w:spacing w:before="20" w:after="20" w:line="240" w:lineRule="auto"/>
+            </w:pPr>
+            <w:r/>
+            <w:r>
+              <w:rPr>
+                <w:rFonts w:ascii="Arial" w:hAnsi="Arial"/>
+                <w:b w:val="0"/>
+                <w:color w:val="555555"/>
+                <w:sz w:val="16"/>
+              </w:rPr>
+            </w:r>
+          </w:p>
+        </w:tc>
+        <w:tc>
+          <w:tcPr>
+            <w:tcW w:type="dxa" w:w="2484"/>
             <w:shd w:val="clear" w:fill="F7F7F7"/>
           </w:tcPr>
           <w:p>
@@ -11512,174 +11126,6 @@
         </w:tblCellMar>
       </w:tblPr>
       <w:tblGrid>
-        <w:gridCol w:w="4968"/>
-        <w:gridCol w:w="4968"/>
-      </w:tblGrid>
-      <w:tr>
-        <w:trPr>
-          <w:cantSplit/>
-        </w:trPr>
-        <w:tc>
-          <w:tcPr>
-            <w:tcW w:type="dxa" w:w="4968"/>
-          </w:tcPr>
-          <w:p>
-            <w:pPr>
-              <w:keepNext/>
-              <w:spacing w:before="40" w:after="40"/>
-              <w:jc w:val="center"/>
-            </w:pPr>
-            <w:r/>
-            <w:r>
-              <w:drawing>
-                <wp:inline xmlns:a="http://schemas.openxmlformats.org/drawingml/2006/main" xmlns:pic="http://schemas.openxmlformats.org/drawingml/2006/picture">
-                  <wp:extent cx="1483770" cy="1828800"/>
-                  <wp:docPr id="4" name="Picture 4"/>
-                  <wp:cNvGraphicFramePr>
-                    <a:graphicFrameLocks noChangeAspect="1"/>
-                  </wp:cNvGraphicFramePr>
-                  <a:graphic>
-                    <a:graphicData uri="http://schemas.openxmlformats.org/drawingml/2006/picture">
-                      <pic:pic>
-                        <pic:nvPicPr>
-                          <pic:cNvPr id="0" name="USA26046-vac-pass5-12in-coke-1.jpg"/>
-                          <pic:cNvPicPr/>
-                        </pic:nvPicPr>
-                        <pic:blipFill>
-                          <a:blip r:embed="rId14"/>
-                          <a:stretch>
-                            <a:fillRect/>
-                          </a:stretch>
-                        </pic:blipFill>
-                        <pic:spPr>
-                          <a:xfrm>
-                            <a:off x="0" y="0"/>
-                            <a:ext cx="1483770" cy="1828800"/>
-                          </a:xfrm>
-                          <a:prstGeom prst="rect"/>
-                        </pic:spPr>
-                      </pic:pic>
-                    </a:graphicData>
-                  </a:graphic>
-                </wp:inline>
-              </w:drawing>
-            </w:r>
-          </w:p>
-        </w:tc>
-        <w:tc>
-          <w:tcPr>
-            <w:tcW w:type="dxa" w:w="4968"/>
-          </w:tcPr>
-          <w:p>
-            <w:pPr>
-              <w:keepNext/>
-              <w:spacing w:before="40" w:after="40"/>
-              <w:jc w:val="center"/>
-            </w:pPr>
-            <w:r/>
-            <w:r>
-              <w:drawing>
-                <wp:inline xmlns:a="http://schemas.openxmlformats.org/drawingml/2006/main" xmlns:pic="http://schemas.openxmlformats.org/drawingml/2006/picture">
-                  <wp:extent cx="2503182" cy="1828800"/>
-                  <wp:docPr id="5" name="Picture 5"/>
-                  <wp:cNvGraphicFramePr>
-                    <a:graphicFrameLocks noChangeAspect="1"/>
-                  </wp:cNvGraphicFramePr>
-                  <a:graphic>
-                    <a:graphicData uri="http://schemas.openxmlformats.org/drawingml/2006/picture">
-                      <pic:pic>
-                        <pic:nvPicPr>
-                          <pic:cNvPr id="0" name="USA26046-vac-pass5-12in-coke-2.jpg"/>
-                          <pic:cNvPicPr/>
-                        </pic:nvPicPr>
-                        <pic:blipFill>
-                          <a:blip r:embed="rId15"/>
-                          <a:stretch>
-                            <a:fillRect/>
-                          </a:stretch>
-                        </pic:blipFill>
-                        <pic:spPr>
-                          <a:xfrm>
-                            <a:off x="0" y="0"/>
-                            <a:ext cx="2503182" cy="1828800"/>
-                          </a:xfrm>
-                          <a:prstGeom prst="rect"/>
-                        </pic:spPr>
-                      </pic:pic>
-                    </a:graphicData>
-                  </a:graphic>
-                </wp:inline>
-              </w:drawing>
-            </w:r>
-          </w:p>
-        </w:tc>
-      </w:tr>
-      <w:tr>
-        <w:trPr>
-          <w:cantSplit/>
-        </w:trPr>
-        <w:tc>
-          <w:tcPr>
-            <w:tcW w:type="dxa" w:w="4968"/>
-          </w:tcPr>
-          <w:p>
-            <w:pPr>
-              <w:spacing w:before="20" w:after="20" w:line="240" w:lineRule="auto"/>
-              <w:jc w:val="center"/>
-            </w:pPr>
-            <w:r/>
-            <w:r>
-              <w:rPr>
-                <w:rFonts w:ascii="Arial" w:hAnsi="Arial"/>
-                <w:b w:val="0"/>
-                <w:color w:val="888888"/>
-                <w:sz w:val="16"/>
-              </w:rPr>
-              <w:t>Coke removed from the 12" tube, Vacuum pass 5.</w:t>
-            </w:r>
-          </w:p>
-        </w:tc>
-        <w:tc>
-          <w:tcPr>
-            <w:tcW w:type="dxa" w:w="4968"/>
-          </w:tcPr>
-          <w:p>
-            <w:pPr>
-              <w:spacing w:before="20" w:after="20" w:line="240" w:lineRule="auto"/>
-              <w:jc w:val="center"/>
-            </w:pPr>
-            <w:r/>
-            <w:r>
-              <w:rPr>
-                <w:rFonts w:ascii="Arial" w:hAnsi="Arial"/>
-                <w:b w:val="0"/>
-                <w:color w:val="888888"/>
-                <w:sz w:val="16"/>
-              </w:rPr>
-              <w:t>The same pass 5 deposit, with a nut for scale.</w:t>
-            </w:r>
-          </w:p>
-        </w:tc>
-      </w:tr>
-    </w:tbl>
-    <w:p>
-      <w:pPr>
-        <w:spacing w:before="0" w:after="0" w:line="120" w:lineRule="exact"/>
-      </w:pPr>
-    </w:p>
-    <w:tbl>
-      <w:tblPr>
-        <w:tblW w:type="auto" w:w="0"/>
-        <w:jc w:val="center"/>
-        <w:tblLook w:firstColumn="1" w:firstRow="1" w:lastColumn="0" w:lastRow="0" w:noHBand="0" w:noVBand="1" w:val="04A0"/>
-        <w:tblCellMar>
-          <w:top w:w="8" w:type="dxa"/>
-          <w:bottom w:w="8" w:type="dxa"/>
-          <w:left w:w="60" w:type="dxa"/>
-          <w:right w:w="60" w:type="dxa"/>
-        </w:tblCellMar>
-      </w:tblPr>
-      <w:tblGrid>
         <w:gridCol w:w="9936"/>
       </w:tblGrid>
       <w:tr>
@@ -11700,8 +11146,8 @@
             <w:r>
               <w:drawing>
                 <wp:inline xmlns:a="http://schemas.openxmlformats.org/drawingml/2006/main" xmlns:pic="http://schemas.openxmlformats.org/drawingml/2006/picture">
-                  <wp:extent cx="4937760" cy="1211438"/>
-                  <wp:docPr id="6" name="Picture 6"/>
+                  <wp:extent cx="5852160" cy="3787605"/>
+                  <wp:docPr id="4" name="Picture 4"/>
                   <wp:cNvGraphicFramePr>
                     <a:graphicFrameLocks noChangeAspect="1"/>
                   </wp:cNvGraphicFramePr>
@@ -11709,11 +11155,11 @@
                     <a:graphicData uri="http://schemas.openxmlformats.org/drawingml/2006/picture">
                       <pic:pic>
                         <pic:nvPicPr>
-                          <pic:cNvPr id="0" name="USA26046-vac-conv-inlet-piping-deposits.jpg"/>
+                          <pic:cNvPr id="0" name="USA26046-vac-deposits-collage.jpg"/>
                           <pic:cNvPicPr/>
                         </pic:nvPicPr>
                         <pic:blipFill>
-                          <a:blip r:embed="rId16"/>
+                          <a:blip r:embed="rId14"/>
                           <a:stretch>
                             <a:fillRect/>
                           </a:stretch>
@@ -11721,7 +11167,7 @@
                         <pic:spPr>
                           <a:xfrm>
                             <a:off x="0" y="0"/>
-                            <a:ext cx="4937760" cy="1211438"/>
+                            <a:ext cx="5852160" cy="3787605"/>
                           </a:xfrm>
                           <a:prstGeom prst="rect"/>
                         </pic:spPr>
@@ -11755,7 +11201,7 @@
                 <w:color w:val="888888"/>
                 <w:sz w:val="16"/>
               </w:rPr>
-              <w:t>Deposits removed from the external 6" convection inlet piping, collected from all eight Vacuum passes.</w:t>
+              <w:t>Top: coke removed from the 12" tube, pass 5. Bottom: deposits removed from the external 6" convection inlet piping, collected from all eight passes.</w:t>
             </w:r>
           </w:p>
         </w:tc>
@@ -11763,22 +11209,61 @@
     </w:tbl>
     <w:p>
       <w:pPr>
-        <w:spacing w:before="120" w:after="60"/>
         <w:keepNext/>
-        <w:pBdr>
-          <w:bottom w:val="single" w:sz="18" w:space="4" w:color="FCC30A"/>
-        </w:pBdr>
+        <w:spacing w:before="0" w:after="0" w:line="320" w:lineRule="exact"/>
       </w:pPr>
-      <w:r>
-        <w:rPr>
-          <w:rFonts w:ascii="Arial" w:hAnsi="Arial"/>
-          <w:b/>
-          <w:color w:val="222222"/>
-          <w:sz w:val="26"/>
-        </w:rPr>
-        <w:t>PR-175169  —  HDS Furnace</w:t>
-      </w:r>
     </w:p>
+    <w:tbl>
+      <w:tblPr>
+        <w:tblW w:type="auto" w:w="0"/>
+        <w:tblLook w:firstColumn="1" w:firstRow="1" w:lastColumn="0" w:lastRow="0" w:noHBand="0" w:noVBand="1" w:val="04A0"/>
+        <w:tblLayout w:type="fixed"/>
+        <w:tblBorders>
+          <w:top w:val="single" w:sz="4" w:space="0" w:color="222222"/>
+          <w:left w:val="single" w:sz="4" w:space="0" w:color="222222"/>
+          <w:bottom w:val="single" w:sz="4" w:space="0" w:color="222222"/>
+          <w:right w:val="single" w:sz="4" w:space="0" w:color="222222"/>
+          <w:insideH w:val="single" w:sz="4" w:space="0" w:color="222222"/>
+          <w:insideV w:val="single" w:sz="4" w:space="0" w:color="222222"/>
+        </w:tblBorders>
+        <w:tblCellMar>
+          <w:top w:w="8" w:type="dxa"/>
+          <w:bottom w:w="8" w:type="dxa"/>
+          <w:left w:w="60" w:type="dxa"/>
+          <w:right w:w="60" w:type="dxa"/>
+        </w:tblCellMar>
+      </w:tblPr>
+      <w:tblGrid>
+        <w:gridCol w:w="9936"/>
+      </w:tblGrid>
+      <w:tr>
+        <w:tc>
+          <w:tcPr>
+            <w:tcW w:type="dxa" w:w="9936"/>
+            <w:shd w:val="clear" w:fill="222222"/>
+            <w:tcBorders>
+              <w:bottom w:val="single" w:sz="18" w:space="0" w:color="FCC30A"/>
+            </w:tcBorders>
+          </w:tcPr>
+          <w:p>
+            <w:pPr>
+              <w:keepNext/>
+              <w:spacing w:before="20" w:after="20" w:line="240" w:lineRule="auto"/>
+            </w:pPr>
+            <w:r/>
+            <w:r>
+              <w:rPr>
+                <w:rFonts w:ascii="Arial" w:hAnsi="Arial"/>
+                <w:b/>
+                <w:color w:val="FFFFFF"/>
+                <w:sz w:val="24"/>
+              </w:rPr>
+              <w:t>PR-175169  —  HDS Furnace</w:t>
+            </w:r>
+          </w:p>
+        </w:tc>
+      </w:tr>
+    </w:tbl>
     <w:tbl>
       <w:tblPr>
         <w:tblW w:type="auto" w:w="0"/>
@@ -12046,7 +11531,7 @@
           <w:color w:val="555555"/>
           <w:sz w:val="20"/>
         </w:rPr>
-        <w:t>Light fouling throughout the convection and radiant sections. Average pigging time was about 20.5 hours per circuit.</w:t>
+        <w:t>Light fouling was found throughout the convection and radiant sections. Average pigging time was approximately 20.5 hours per circuit.</w:t>
       </w:r>
     </w:p>
     <w:p>
@@ -12058,8 +11543,8 @@
       <w:r>
         <w:drawing>
           <wp:inline xmlns:a="http://schemas.openxmlformats.org/drawingml/2006/main" xmlns:pic="http://schemas.openxmlformats.org/drawingml/2006/picture">
-            <wp:extent cx="6309360" cy="966120"/>
-            <wp:docPr id="7" name="Picture 7"/>
+            <wp:extent cx="5852160" cy="786384"/>
+            <wp:docPr id="5" name="Picture 5"/>
             <wp:cNvGraphicFramePr>
               <a:graphicFrameLocks noChangeAspect="1"/>
             </wp:cNvGraphicFramePr>
@@ -12071,7 +11556,7 @@
                     <pic:cNvPicPr/>
                   </pic:nvPicPr>
                   <pic:blipFill>
-                    <a:blip r:embed="rId17"/>
+                    <a:blip r:embed="rId15"/>
                     <a:stretch>
                       <a:fillRect/>
                     </a:stretch>
@@ -12079,7 +11564,7 @@
                   <pic:spPr>
                     <a:xfrm>
                       <a:off x="0" y="0"/>
-                      <a:ext cx="6309360" cy="966120"/>
+                      <a:ext cx="5852160" cy="786384"/>
                     </a:xfrm>
                     <a:prstGeom prst="rect"/>
                   </pic:spPr>
@@ -12141,13 +11626,13 @@
         </w:tblCellMar>
       </w:tblPr>
       <w:tblGrid>
-        <w:gridCol w:w="2015"/>
-        <w:gridCol w:w="7920"/>
+        <w:gridCol w:w="4968"/>
+        <w:gridCol w:w="4968"/>
       </w:tblGrid>
       <w:tr>
         <w:tc>
           <w:tcPr>
-            <w:tcW w:type="dxa" w:w="2016"/>
+            <w:tcW w:type="dxa" w:w="4968"/>
             <w:shd w:val="clear" w:fill="222222"/>
           </w:tcPr>
           <w:p>
@@ -12163,13 +11648,13 @@
                 <w:color w:val="FFFFFF"/>
                 <w:sz w:val="16"/>
               </w:rPr>
-              <w:t>SIZE</w:t>
+              <w:t>SIZE — QTY</w:t>
             </w:r>
           </w:p>
         </w:tc>
         <w:tc>
           <w:tcPr>
-            <w:tcW w:type="dxa" w:w="7920"/>
+            <w:tcW w:type="dxa" w:w="4968"/>
             <w:shd w:val="clear" w:fill="222222"/>
           </w:tcPr>
           <w:p>
@@ -12185,7 +11670,7 @@
                 <w:color w:val="FFFFFF"/>
                 <w:sz w:val="16"/>
               </w:rPr>
-              <w:t>QTY</w:t>
+              <w:t>SIZE — QTY</w:t>
             </w:r>
           </w:p>
         </w:tc>
@@ -12193,7 +11678,7 @@
       <w:tr>
         <w:tc>
           <w:tcPr>
-            <w:tcW w:type="dxa" w:w="2016"/>
+            <w:tcW w:type="dxa" w:w="4968"/>
           </w:tcPr>
           <w:p>
             <w:pPr>
@@ -12206,40 +11691,15 @@
                 <w:rFonts w:ascii="Arial" w:hAnsi="Arial"/>
                 <w:b w:val="0"/>
                 <w:color w:val="555555"/>
-                <w:sz w:val="16"/>
+                <w:sz w:val="17"/>
               </w:rPr>
-              <w:t>6"</w:t>
+              <w:t>6"  —  4</w:t>
             </w:r>
           </w:p>
         </w:tc>
         <w:tc>
           <w:tcPr>
-            <w:tcW w:type="dxa" w:w="7920"/>
-          </w:tcPr>
-          <w:p>
-            <w:pPr>
-              <w:keepNext/>
-              <w:spacing w:before="20" w:after="20" w:line="240" w:lineRule="auto"/>
-              <w:jc w:val="center"/>
-            </w:pPr>
-            <w:r/>
-            <w:r>
-              <w:rPr>
-                <w:rFonts w:ascii="Arial" w:hAnsi="Arial"/>
-                <w:b w:val="0"/>
-                <w:color w:val="555555"/>
-                <w:sz w:val="16"/>
-              </w:rPr>
-              <w:t>4</w:t>
-            </w:r>
-          </w:p>
-        </w:tc>
-      </w:tr>
-      <w:tr>
-        <w:tc>
-          <w:tcPr>
-            <w:tcW w:type="dxa" w:w="2016"/>
-            <w:shd w:val="clear" w:fill="F7F7F7"/>
+            <w:tcW w:type="dxa" w:w="4968"/>
           </w:tcPr>
           <w:p>
             <w:pPr>
@@ -12252,32 +11712,9 @@
                 <w:rFonts w:ascii="Arial" w:hAnsi="Arial"/>
                 <w:b w:val="0"/>
                 <w:color w:val="555555"/>
-                <w:sz w:val="16"/>
+                <w:sz w:val="17"/>
               </w:rPr>
-              <w:t>6.25"</w:t>
-            </w:r>
-          </w:p>
-        </w:tc>
-        <w:tc>
-          <w:tcPr>
-            <w:tcW w:type="dxa" w:w="7920"/>
-            <w:shd w:val="clear" w:fill="F7F7F7"/>
-          </w:tcPr>
-          <w:p>
-            <w:pPr>
-              <w:keepNext/>
-              <w:spacing w:before="20" w:after="20" w:line="240" w:lineRule="auto"/>
-              <w:jc w:val="center"/>
-            </w:pPr>
-            <w:r/>
-            <w:r>
-              <w:rPr>
-                <w:rFonts w:ascii="Arial" w:hAnsi="Arial"/>
-                <w:b w:val="0"/>
-                <w:color w:val="555555"/>
-                <w:sz w:val="16"/>
-              </w:rPr>
-              <w:t>12</w:t>
+              <w:t>6.25"  —  12</w:t>
             </w:r>
           </w:p>
         </w:tc>
@@ -12285,7 +11722,7 @@
       <w:tr>
         <w:tc>
           <w:tcPr>
-            <w:tcW w:type="dxa" w:w="2016"/>
+            <w:tcW w:type="dxa" w:w="4968"/>
             <w:shd w:val="clear" w:fill="F7F7F7"/>
           </w:tcPr>
           <w:p>
@@ -12298,31 +11735,29 @@
                 <w:rFonts w:ascii="Arial" w:hAnsi="Arial"/>
                 <w:b/>
                 <w:color w:val="222222"/>
-                <w:sz w:val="16"/>
+                <w:sz w:val="17"/>
               </w:rPr>
-              <w:t>TOTAL</w:t>
+              <w:t>TOTAL  —  16</w:t>
             </w:r>
           </w:p>
         </w:tc>
         <w:tc>
           <w:tcPr>
-            <w:tcW w:type="dxa" w:w="7920"/>
+            <w:tcW w:type="dxa" w:w="4968"/>
             <w:shd w:val="clear" w:fill="F7F7F7"/>
           </w:tcPr>
           <w:p>
             <w:pPr>
               <w:spacing w:before="20" w:after="20" w:line="240" w:lineRule="auto"/>
-              <w:jc w:val="center"/>
             </w:pPr>
             <w:r/>
             <w:r>
               <w:rPr>
                 <w:rFonts w:ascii="Arial" w:hAnsi="Arial"/>
-                <w:b/>
-                <w:color w:val="222222"/>
+                <w:b w:val="0"/>
+                <w:color w:val="555555"/>
                 <w:sz w:val="16"/>
               </w:rPr>
-              <w:t>16</w:t>
             </w:r>
           </w:p>
         </w:tc>
@@ -13181,22 +12616,61 @@
     </w:tbl>
     <w:p>
       <w:pPr>
-        <w:spacing w:before="120" w:after="60"/>
         <w:keepNext/>
-        <w:pBdr>
-          <w:bottom w:val="single" w:sz="18" w:space="4" w:color="FCC30A"/>
-        </w:pBdr>
+        <w:spacing w:before="0" w:after="0" w:line="320" w:lineRule="exact"/>
       </w:pPr>
-      <w:r>
-        <w:rPr>
-          <w:rFonts w:ascii="Arial" w:hAnsi="Arial"/>
-          <w:b/>
-          <w:color w:val="222222"/>
-          <w:sz w:val="26"/>
-        </w:rPr>
-        <w:t>PR-170002  —  Coker Furnace</w:t>
-      </w:r>
     </w:p>
+    <w:tbl>
+      <w:tblPr>
+        <w:tblW w:type="auto" w:w="0"/>
+        <w:tblLook w:firstColumn="1" w:firstRow="1" w:lastColumn="0" w:lastRow="0" w:noHBand="0" w:noVBand="1" w:val="04A0"/>
+        <w:tblLayout w:type="fixed"/>
+        <w:tblBorders>
+          <w:top w:val="single" w:sz="4" w:space="0" w:color="222222"/>
+          <w:left w:val="single" w:sz="4" w:space="0" w:color="222222"/>
+          <w:bottom w:val="single" w:sz="4" w:space="0" w:color="222222"/>
+          <w:right w:val="single" w:sz="4" w:space="0" w:color="222222"/>
+          <w:insideH w:val="single" w:sz="4" w:space="0" w:color="222222"/>
+          <w:insideV w:val="single" w:sz="4" w:space="0" w:color="222222"/>
+        </w:tblBorders>
+        <w:tblCellMar>
+          <w:top w:w="8" w:type="dxa"/>
+          <w:bottom w:w="8" w:type="dxa"/>
+          <w:left w:w="60" w:type="dxa"/>
+          <w:right w:w="60" w:type="dxa"/>
+        </w:tblCellMar>
+      </w:tblPr>
+      <w:tblGrid>
+        <w:gridCol w:w="9936"/>
+      </w:tblGrid>
+      <w:tr>
+        <w:tc>
+          <w:tcPr>
+            <w:tcW w:type="dxa" w:w="9936"/>
+            <w:shd w:val="clear" w:fill="222222"/>
+            <w:tcBorders>
+              <w:bottom w:val="single" w:sz="18" w:space="0" w:color="FCC30A"/>
+            </w:tcBorders>
+          </w:tcPr>
+          <w:p>
+            <w:pPr>
+              <w:keepNext/>
+              <w:spacing w:before="20" w:after="20" w:line="240" w:lineRule="auto"/>
+            </w:pPr>
+            <w:r/>
+            <w:r>
+              <w:rPr>
+                <w:rFonts w:ascii="Arial" w:hAnsi="Arial"/>
+                <w:b/>
+                <w:color w:val="FFFFFF"/>
+                <w:sz w:val="24"/>
+              </w:rPr>
+              <w:t>PR-170002  —  Coker Furnace</w:t>
+            </w:r>
+          </w:p>
+        </w:tc>
+      </w:tr>
+    </w:tbl>
     <w:tbl>
       <w:tblPr>
         <w:tblW w:type="auto" w:w="0"/>
@@ -13464,7 +12938,7 @@
           <w:color w:val="555555"/>
           <w:sz w:val="20"/>
         </w:rPr>
-        <w:t>Light fouling in the convection, moderate in the radiant section. The crossovers were removed and the radiant passes looped A + B and C + D with temporary 180s at the radiant inlet flanges. Average pigging time was about 51 hours per circuit.</w:t>
+        <w:t>The convection section showed light fouling and the radiant section moderate fouling. The crossovers were removed, the convection was pigged as a single circuit, and the radiant passes were looped A + B and C + D with temporary 180° returns at the radiant inlet flanges. Average pigging time was approximately 51 hours per circuit.</w:t>
       </w:r>
     </w:p>
     <w:p>
@@ -13476,8 +12950,8 @@
       <w:r>
         <w:drawing>
           <wp:inline xmlns:a="http://schemas.openxmlformats.org/drawingml/2006/main" xmlns:pic="http://schemas.openxmlformats.org/drawingml/2006/picture">
-            <wp:extent cx="6309360" cy="1350597"/>
-            <wp:docPr id="8" name="Picture 8"/>
+            <wp:extent cx="5852160" cy="1060704"/>
+            <wp:docPr id="6" name="Picture 6"/>
             <wp:cNvGraphicFramePr>
               <a:graphicFrameLocks noChangeAspect="1"/>
             </wp:cNvGraphicFramePr>
@@ -13489,7 +12963,7 @@
                     <pic:cNvPicPr/>
                   </pic:nvPicPr>
                   <pic:blipFill>
-                    <a:blip r:embed="rId18"/>
+                    <a:blip r:embed="rId16"/>
                     <a:stretch>
                       <a:fillRect/>
                     </a:stretch>
@@ -13497,7 +12971,7 @@
                   <pic:spPr>
                     <a:xfrm>
                       <a:off x="0" y="0"/>
-                      <a:ext cx="6309360" cy="1350597"/>
+                      <a:ext cx="5852160" cy="1060704"/>
                     </a:xfrm>
                     <a:prstGeom prst="rect"/>
                   </pic:spPr>
@@ -13559,15 +13033,15 @@
         </w:tblCellMar>
       </w:tblPr>
       <w:tblGrid>
-        <w:gridCol w:w="2015"/>
-        <w:gridCol w:w="2639"/>
-        <w:gridCol w:w="2639"/>
-        <w:gridCol w:w="2639"/>
+        <w:gridCol w:w="2484"/>
+        <w:gridCol w:w="2484"/>
+        <w:gridCol w:w="2484"/>
+        <w:gridCol w:w="2484"/>
       </w:tblGrid>
       <w:tr>
         <w:tc>
           <w:tcPr>
-            <w:tcW w:type="dxa" w:w="2016"/>
+            <w:tcW w:type="dxa" w:w="2484"/>
             <w:shd w:val="clear" w:fill="222222"/>
           </w:tcPr>
           <w:p>
@@ -13583,13 +13057,13 @@
                 <w:color w:val="FFFFFF"/>
                 <w:sz w:val="16"/>
               </w:rPr>
-              <w:t>SIZE</w:t>
+              <w:t>SIZE — QTY</w:t>
             </w:r>
           </w:p>
         </w:tc>
         <w:tc>
           <w:tcPr>
-            <w:tcW w:type="dxa" w:w="2640"/>
+            <w:tcW w:type="dxa" w:w="2484"/>
             <w:shd w:val="clear" w:fill="222222"/>
           </w:tcPr>
           <w:p>
@@ -13605,13 +13079,13 @@
                 <w:color w:val="FFFFFF"/>
                 <w:sz w:val="16"/>
               </w:rPr>
-              <w:t>QTY</w:t>
+              <w:t>SIZE — QTY</w:t>
             </w:r>
           </w:p>
         </w:tc>
         <w:tc>
           <w:tcPr>
-            <w:tcW w:type="dxa" w:w="2640"/>
+            <w:tcW w:type="dxa" w:w="2484"/>
             <w:shd w:val="clear" w:fill="222222"/>
           </w:tcPr>
           <w:p>
@@ -13627,13 +13101,13 @@
                 <w:color w:val="FFFFFF"/>
                 <w:sz w:val="16"/>
               </w:rPr>
-              <w:t>SIZE</w:t>
+              <w:t>SIZE — QTY</w:t>
             </w:r>
           </w:p>
         </w:tc>
         <w:tc>
           <w:tcPr>
-            <w:tcW w:type="dxa" w:w="2640"/>
+            <w:tcW w:type="dxa" w:w="2484"/>
             <w:shd w:val="clear" w:fill="222222"/>
           </w:tcPr>
           <w:p>
@@ -13649,7 +13123,7 @@
                 <w:color w:val="FFFFFF"/>
                 <w:sz w:val="16"/>
               </w:rPr>
-              <w:t>QTY</w:t>
+              <w:t>SIZE — QTY</w:t>
             </w:r>
           </w:p>
         </w:tc>
@@ -13657,7 +13131,7 @@
       <w:tr>
         <w:tc>
           <w:tcPr>
-            <w:tcW w:type="dxa" w:w="2016"/>
+            <w:tcW w:type="dxa" w:w="2484"/>
           </w:tcPr>
           <w:p>
             <w:pPr>
@@ -13670,37 +13144,15 @@
                 <w:rFonts w:ascii="Arial" w:hAnsi="Arial"/>
                 <w:b w:val="0"/>
                 <w:color w:val="555555"/>
-                <w:sz w:val="16"/>
+                <w:sz w:val="17"/>
               </w:rPr>
-              <w:t>3"</w:t>
+              <w:t>3"  —  3</w:t>
             </w:r>
           </w:p>
         </w:tc>
         <w:tc>
           <w:tcPr>
-            <w:tcW w:type="dxa" w:w="2640"/>
-          </w:tcPr>
-          <w:p>
-            <w:pPr>
-              <w:keepNext/>
-              <w:spacing w:before="20" w:after="20" w:line="240" w:lineRule="auto"/>
-              <w:jc w:val="center"/>
-            </w:pPr>
-            <w:r/>
-            <w:r>
-              <w:rPr>
-                <w:rFonts w:ascii="Arial" w:hAnsi="Arial"/>
-                <w:b w:val="0"/>
-                <w:color w:val="555555"/>
-                <w:sz w:val="16"/>
-              </w:rPr>
-              <w:t>3</w:t>
-            </w:r>
-          </w:p>
-        </w:tc>
-        <w:tc>
-          <w:tcPr>
-            <w:tcW w:type="dxa" w:w="2640"/>
+            <w:tcW w:type="dxa" w:w="2484"/>
           </w:tcPr>
           <w:p>
             <w:pPr>
@@ -13713,21 +13165,20 @@
                 <w:rFonts w:ascii="Arial" w:hAnsi="Arial"/>
                 <w:b w:val="0"/>
                 <w:color w:val="555555"/>
-                <w:sz w:val="16"/>
+                <w:sz w:val="17"/>
               </w:rPr>
-              <w:t>3.5"</w:t>
+              <w:t>3.3"  —  2</w:t>
             </w:r>
           </w:p>
         </w:tc>
         <w:tc>
           <w:tcPr>
-            <w:tcW w:type="dxa" w:w="2640"/>
+            <w:tcW w:type="dxa" w:w="2484"/>
           </w:tcPr>
           <w:p>
             <w:pPr>
               <w:keepNext/>
               <w:spacing w:before="20" w:after="20" w:line="240" w:lineRule="auto"/>
-              <w:jc w:val="center"/>
             </w:pPr>
             <w:r/>
             <w:r>
@@ -13735,9 +13186,30 @@
                 <w:rFonts w:ascii="Arial" w:hAnsi="Arial"/>
                 <w:b w:val="0"/>
                 <w:color w:val="555555"/>
-                <w:sz w:val="16"/>
+                <w:sz w:val="17"/>
               </w:rPr>
-              <w:t>6</w:t>
+              <w:t>3.625"  —  21</w:t>
+            </w:r>
+          </w:p>
+        </w:tc>
+        <w:tc>
+          <w:tcPr>
+            <w:tcW w:type="dxa" w:w="2484"/>
+          </w:tcPr>
+          <w:p>
+            <w:pPr>
+              <w:keepNext/>
+              <w:spacing w:before="20" w:after="20" w:line="240" w:lineRule="auto"/>
+            </w:pPr>
+            <w:r/>
+            <w:r>
+              <w:rPr>
+                <w:rFonts w:ascii="Arial" w:hAnsi="Arial"/>
+                <w:b w:val="0"/>
+                <w:color w:val="555555"/>
+                <w:sz w:val="17"/>
+              </w:rPr>
+              <w:t>4"  —  2</w:t>
             </w:r>
           </w:p>
         </w:tc>
@@ -13745,7 +13217,7 @@
       <w:tr>
         <w:tc>
           <w:tcPr>
-            <w:tcW w:type="dxa" w:w="2016"/>
+            <w:tcW w:type="dxa" w:w="2484"/>
             <w:shd w:val="clear" w:fill="F7F7F7"/>
           </w:tcPr>
           <w:p>
@@ -13759,38 +13231,15 @@
                 <w:rFonts w:ascii="Arial" w:hAnsi="Arial"/>
                 <w:b w:val="0"/>
                 <w:color w:val="555555"/>
-                <w:sz w:val="16"/>
+                <w:sz w:val="17"/>
               </w:rPr>
-              <w:t>3.125"</w:t>
+              <w:t>3.125"  —  3</w:t>
             </w:r>
           </w:p>
         </w:tc>
         <w:tc>
           <w:tcPr>
-            <w:tcW w:type="dxa" w:w="2640"/>
-            <w:shd w:val="clear" w:fill="F7F7F7"/>
-          </w:tcPr>
-          <w:p>
-            <w:pPr>
-              <w:keepNext/>
-              <w:spacing w:before="20" w:after="20" w:line="240" w:lineRule="auto"/>
-              <w:jc w:val="center"/>
-            </w:pPr>
-            <w:r/>
-            <w:r>
-              <w:rPr>
-                <w:rFonts w:ascii="Arial" w:hAnsi="Arial"/>
-                <w:b w:val="0"/>
-                <w:color w:val="555555"/>
-                <w:sz w:val="16"/>
-              </w:rPr>
-              <w:t>3</w:t>
-            </w:r>
-          </w:p>
-        </w:tc>
-        <w:tc>
-          <w:tcPr>
-            <w:tcW w:type="dxa" w:w="2640"/>
+            <w:tcW w:type="dxa" w:w="2484"/>
             <w:shd w:val="clear" w:fill="F7F7F7"/>
           </w:tcPr>
           <w:p>
@@ -13804,128 +13253,15 @@
                 <w:rFonts w:ascii="Arial" w:hAnsi="Arial"/>
                 <w:b w:val="0"/>
                 <w:color w:val="555555"/>
-                <w:sz w:val="16"/>
+                <w:sz w:val="17"/>
               </w:rPr>
-              <w:t>3.625"</w:t>
+              <w:t>3.325"  —  3</w:t>
             </w:r>
           </w:p>
         </w:tc>
         <w:tc>
           <w:tcPr>
-            <w:tcW w:type="dxa" w:w="2640"/>
-            <w:shd w:val="clear" w:fill="F7F7F7"/>
-          </w:tcPr>
-          <w:p>
-            <w:pPr>
-              <w:keepNext/>
-              <w:spacing w:before="20" w:after="20" w:line="240" w:lineRule="auto"/>
-              <w:jc w:val="center"/>
-            </w:pPr>
-            <w:r/>
-            <w:r>
-              <w:rPr>
-                <w:rFonts w:ascii="Arial" w:hAnsi="Arial"/>
-                <w:b w:val="0"/>
-                <w:color w:val="555555"/>
-                <w:sz w:val="16"/>
-              </w:rPr>
-              <w:t>21</w:t>
-            </w:r>
-          </w:p>
-        </w:tc>
-      </w:tr>
-      <w:tr>
-        <w:tc>
-          <w:tcPr>
-            <w:tcW w:type="dxa" w:w="2016"/>
-          </w:tcPr>
-          <w:p>
-            <w:pPr>
-              <w:keepNext/>
-              <w:spacing w:before="20" w:after="20" w:line="240" w:lineRule="auto"/>
-            </w:pPr>
-            <w:r/>
-            <w:r>
-              <w:rPr>
-                <w:rFonts w:ascii="Arial" w:hAnsi="Arial"/>
-                <w:b w:val="0"/>
-                <w:color w:val="555555"/>
-                <w:sz w:val="16"/>
-              </w:rPr>
-              <w:t>3.25"</w:t>
-            </w:r>
-          </w:p>
-        </w:tc>
-        <w:tc>
-          <w:tcPr>
-            <w:tcW w:type="dxa" w:w="2640"/>
-          </w:tcPr>
-          <w:p>
-            <w:pPr>
-              <w:keepNext/>
-              <w:spacing w:before="20" w:after="20" w:line="240" w:lineRule="auto"/>
-              <w:jc w:val="center"/>
-            </w:pPr>
-            <w:r/>
-            <w:r>
-              <w:rPr>
-                <w:rFonts w:ascii="Arial" w:hAnsi="Arial"/>
-                <w:b w:val="0"/>
-                <w:color w:val="555555"/>
-                <w:sz w:val="16"/>
-              </w:rPr>
-              <w:t>6</w:t>
-            </w:r>
-          </w:p>
-        </w:tc>
-        <w:tc>
-          <w:tcPr>
-            <w:tcW w:type="dxa" w:w="2640"/>
-          </w:tcPr>
-          <w:p>
-            <w:pPr>
-              <w:keepNext/>
-              <w:spacing w:before="20" w:after="20" w:line="240" w:lineRule="auto"/>
-            </w:pPr>
-            <w:r/>
-            <w:r>
-              <w:rPr>
-                <w:rFonts w:ascii="Arial" w:hAnsi="Arial"/>
-                <w:b w:val="0"/>
-                <w:color w:val="555555"/>
-                <w:sz w:val="16"/>
-              </w:rPr>
-              <w:t>3.75"</w:t>
-            </w:r>
-          </w:p>
-        </w:tc>
-        <w:tc>
-          <w:tcPr>
-            <w:tcW w:type="dxa" w:w="2640"/>
-          </w:tcPr>
-          <w:p>
-            <w:pPr>
-              <w:keepNext/>
-              <w:spacing w:before="20" w:after="20" w:line="240" w:lineRule="auto"/>
-              <w:jc w:val="center"/>
-            </w:pPr>
-            <w:r/>
-            <w:r>
-              <w:rPr>
-                <w:rFonts w:ascii="Arial" w:hAnsi="Arial"/>
-                <w:b w:val="0"/>
-                <w:color w:val="555555"/>
-                <w:sz w:val="16"/>
-              </w:rPr>
-              <w:t>14</w:t>
-            </w:r>
-          </w:p>
-        </w:tc>
-      </w:tr>
-      <w:tr>
-        <w:tc>
-          <w:tcPr>
-            <w:tcW w:type="dxa" w:w="2016"/>
+            <w:tcW w:type="dxa" w:w="2484"/>
             <w:shd w:val="clear" w:fill="F7F7F7"/>
           </w:tcPr>
           <w:p>
@@ -13939,38 +13275,15 @@
                 <w:rFonts w:ascii="Arial" w:hAnsi="Arial"/>
                 <w:b w:val="0"/>
                 <w:color w:val="555555"/>
-                <w:sz w:val="16"/>
+                <w:sz w:val="17"/>
               </w:rPr>
-              <w:t>3.3"</w:t>
+              <w:t>3.75"  —  14</w:t>
             </w:r>
           </w:p>
         </w:tc>
         <w:tc>
           <w:tcPr>
-            <w:tcW w:type="dxa" w:w="2640"/>
-            <w:shd w:val="clear" w:fill="F7F7F7"/>
-          </w:tcPr>
-          <w:p>
-            <w:pPr>
-              <w:keepNext/>
-              <w:spacing w:before="20" w:after="20" w:line="240" w:lineRule="auto"/>
-              <w:jc w:val="center"/>
-            </w:pPr>
-            <w:r/>
-            <w:r>
-              <w:rPr>
-                <w:rFonts w:ascii="Arial" w:hAnsi="Arial"/>
-                <w:b w:val="0"/>
-                <w:color w:val="555555"/>
-                <w:sz w:val="16"/>
-              </w:rPr>
-              <w:t>2</w:t>
-            </w:r>
-          </w:p>
-        </w:tc>
-        <w:tc>
-          <w:tcPr>
-            <w:tcW w:type="dxa" w:w="2640"/>
+            <w:tcW w:type="dxa" w:w="2484"/>
             <w:shd w:val="clear" w:fill="F7F7F7"/>
           </w:tcPr>
           <w:p>
@@ -13984,32 +13297,8 @@
                 <w:rFonts w:ascii="Arial" w:hAnsi="Arial"/>
                 <w:b w:val="0"/>
                 <w:color w:val="555555"/>
-                <w:sz w:val="16"/>
+                <w:sz w:val="17"/>
               </w:rPr>
-              <w:t>3.875"</w:t>
-            </w:r>
-          </w:p>
-        </w:tc>
-        <w:tc>
-          <w:tcPr>
-            <w:tcW w:type="dxa" w:w="2640"/>
-            <w:shd w:val="clear" w:fill="F7F7F7"/>
-          </w:tcPr>
-          <w:p>
-            <w:pPr>
-              <w:keepNext/>
-              <w:spacing w:before="20" w:after="20" w:line="240" w:lineRule="auto"/>
-              <w:jc w:val="center"/>
-            </w:pPr>
-            <w:r/>
-            <w:r>
-              <w:rPr>
-                <w:rFonts w:ascii="Arial" w:hAnsi="Arial"/>
-                <w:b w:val="0"/>
-                <w:color w:val="555555"/>
-                <w:sz w:val="16"/>
-              </w:rPr>
-              <w:t>4</w:t>
             </w:r>
           </w:p>
         </w:tc>
@@ -14017,7 +13306,7 @@
       <w:tr>
         <w:tc>
           <w:tcPr>
-            <w:tcW w:type="dxa" w:w="2016"/>
+            <w:tcW w:type="dxa" w:w="2484"/>
           </w:tcPr>
           <w:p>
             <w:pPr>
@@ -14030,37 +13319,15 @@
                 <w:rFonts w:ascii="Arial" w:hAnsi="Arial"/>
                 <w:b w:val="0"/>
                 <w:color w:val="555555"/>
-                <w:sz w:val="16"/>
+                <w:sz w:val="17"/>
               </w:rPr>
-              <w:t>3.325"</w:t>
+              <w:t>3.25"  —  6</w:t>
             </w:r>
           </w:p>
         </w:tc>
         <w:tc>
           <w:tcPr>
-            <w:tcW w:type="dxa" w:w="2640"/>
-          </w:tcPr>
-          <w:p>
-            <w:pPr>
-              <w:keepNext/>
-              <w:spacing w:before="20" w:after="20" w:line="240" w:lineRule="auto"/>
-              <w:jc w:val="center"/>
-            </w:pPr>
-            <w:r/>
-            <w:r>
-              <w:rPr>
-                <w:rFonts w:ascii="Arial" w:hAnsi="Arial"/>
-                <w:b w:val="0"/>
-                <w:color w:val="555555"/>
-                <w:sz w:val="16"/>
-              </w:rPr>
-              <w:t>3</w:t>
-            </w:r>
-          </w:p>
-        </w:tc>
-        <w:tc>
-          <w:tcPr>
-            <w:tcW w:type="dxa" w:w="2640"/>
+            <w:tcW w:type="dxa" w:w="2484"/>
           </w:tcPr>
           <w:p>
             <w:pPr>
@@ -14073,21 +13340,20 @@
                 <w:rFonts w:ascii="Arial" w:hAnsi="Arial"/>
                 <w:b w:val="0"/>
                 <w:color w:val="555555"/>
-                <w:sz w:val="16"/>
+                <w:sz w:val="17"/>
               </w:rPr>
-              <w:t>4"</w:t>
+              <w:t>3.5"  —  6</w:t>
             </w:r>
           </w:p>
         </w:tc>
         <w:tc>
           <w:tcPr>
-            <w:tcW w:type="dxa" w:w="2640"/>
+            <w:tcW w:type="dxa" w:w="2484"/>
           </w:tcPr>
           <w:p>
             <w:pPr>
               <w:keepNext/>
               <w:spacing w:before="20" w:after="20" w:line="240" w:lineRule="auto"/>
-              <w:jc w:val="center"/>
             </w:pPr>
             <w:r/>
             <w:r>
@@ -14095,9 +13361,29 @@
                 <w:rFonts w:ascii="Arial" w:hAnsi="Arial"/>
                 <w:b w:val="0"/>
                 <w:color w:val="555555"/>
-                <w:sz w:val="16"/>
+                <w:sz w:val="17"/>
               </w:rPr>
-              <w:t>2</w:t>
+              <w:t>3.875"  —  4</w:t>
+            </w:r>
+          </w:p>
+        </w:tc>
+        <w:tc>
+          <w:tcPr>
+            <w:tcW w:type="dxa" w:w="2484"/>
+          </w:tcPr>
+          <w:p>
+            <w:pPr>
+              <w:keepNext/>
+              <w:spacing w:before="20" w:after="20" w:line="240" w:lineRule="auto"/>
+            </w:pPr>
+            <w:r/>
+            <w:r>
+              <w:rPr>
+                <w:rFonts w:ascii="Arial" w:hAnsi="Arial"/>
+                <w:b w:val="0"/>
+                <w:color w:val="555555"/>
+                <w:sz w:val="17"/>
+              </w:rPr>
             </w:r>
           </w:p>
         </w:tc>
@@ -14105,7 +13391,7 @@
       <w:tr>
         <w:tc>
           <w:tcPr>
-            <w:tcW w:type="dxa" w:w="2016"/>
+            <w:tcW w:type="dxa" w:w="2484"/>
             <w:shd w:val="clear" w:fill="F7F7F7"/>
           </w:tcPr>
           <w:p>
@@ -14118,37 +13404,15 @@
                 <w:rFonts w:ascii="Arial" w:hAnsi="Arial"/>
                 <w:b/>
                 <w:color w:val="222222"/>
-                <w:sz w:val="16"/>
+                <w:sz w:val="17"/>
               </w:rPr>
-              <w:t>TOTAL</w:t>
+              <w:t>TOTAL  —  64</w:t>
             </w:r>
           </w:p>
         </w:tc>
         <w:tc>
           <w:tcPr>
-            <w:tcW w:type="dxa" w:w="2640"/>
-            <w:shd w:val="clear" w:fill="F7F7F7"/>
-          </w:tcPr>
-          <w:p>
-            <w:pPr>
-              <w:spacing w:before="20" w:after="20" w:line="240" w:lineRule="auto"/>
-              <w:jc w:val="center"/>
-            </w:pPr>
-            <w:r/>
-            <w:r>
-              <w:rPr>
-                <w:rFonts w:ascii="Arial" w:hAnsi="Arial"/>
-                <w:b/>
-                <w:color w:val="222222"/>
-                <w:sz w:val="16"/>
-              </w:rPr>
-              <w:t>64</w:t>
-            </w:r>
-          </w:p>
-        </w:tc>
-        <w:tc>
-          <w:tcPr>
-            <w:tcW w:type="dxa" w:w="2640"/>
+            <w:tcW w:type="dxa" w:w="2484"/>
             <w:shd w:val="clear" w:fill="F7F7F7"/>
           </w:tcPr>
           <w:p>
@@ -14168,7 +13432,27 @@
         </w:tc>
         <w:tc>
           <w:tcPr>
-            <w:tcW w:type="dxa" w:w="2640"/>
+            <w:tcW w:type="dxa" w:w="2484"/>
+            <w:shd w:val="clear" w:fill="F7F7F7"/>
+          </w:tcPr>
+          <w:p>
+            <w:pPr>
+              <w:spacing w:before="20" w:after="20" w:line="240" w:lineRule="auto"/>
+            </w:pPr>
+            <w:r/>
+            <w:r>
+              <w:rPr>
+                <w:rFonts w:ascii="Arial" w:hAnsi="Arial"/>
+                <w:b w:val="0"/>
+                <w:color w:val="555555"/>
+                <w:sz w:val="16"/>
+              </w:rPr>
+            </w:r>
+          </w:p>
+        </w:tc>
+        <w:tc>
+          <w:tcPr>
+            <w:tcW w:type="dxa" w:w="2484"/>
             <w:shd w:val="clear" w:fill="F7F7F7"/>
           </w:tcPr>
           <w:p>
@@ -15181,7 +14465,7 @@
       <w:headerReference w:type="default" r:id="rId9"/>
       <w:footerReference w:type="default" r:id="rId10"/>
       <w:pgSz w:w="12240" w:h="15840"/>
-      <w:pgMar w:top="1008" w:right="1152" w:bottom="1008" w:left="1152" w:header="720" w:footer="720" w:gutter="0"/>
+      <w:pgMar w:top="1368" w:right="1152" w:bottom="1008" w:left="1152" w:header="576" w:footer="720" w:gutter="0"/>
       <w:cols w:space="720"/>
       <w:docGrid w:linePitch="360"/>
     </w:sectPr>

</xml_diff>

<commit_message>
[Lane 1] USA26046 report: Vac outlet graphic moved to Images beside the collage, contact in signature, 6 pages
Co-Authored-By: Claude Opus 5.5 <noreply@anthropic.com>
</commit_message>
<xml_diff>
--- a/02-facilities/Cenovus/Lima-OH/USA26046-Cenovus-Lima-Job-Report.docx
+++ b/02-facilities/Cenovus/Lima-OH/USA26046-Cenovus-Lima-Job-Report.docx
@@ -2980,7 +2980,7 @@
       <w:r>
         <w:drawing>
           <wp:inline xmlns:a="http://schemas.openxmlformats.org/drawingml/2006/main" xmlns:pic="http://schemas.openxmlformats.org/drawingml/2006/picture">
-            <wp:extent cx="5852160" cy="1883664"/>
+            <wp:extent cx="4937760" cy="1589342"/>
             <wp:docPr id="1" name="Picture 1"/>
             <wp:cNvGraphicFramePr>
               <a:graphicFrameLocks noChangeAspect="1"/>
@@ -3001,7 +3001,7 @@
                   <pic:spPr>
                     <a:xfrm>
                       <a:off x="0" y="0"/>
-                      <a:ext cx="5852160" cy="1883664"/>
+                      <a:ext cx="4937760" cy="1589342"/>
                     </a:xfrm>
                     <a:prstGeom prst="rect"/>
                   </pic:spPr>
@@ -3417,20 +3417,6 @@
         </w:tc>
       </w:tr>
     </w:tbl>
-    <w:p>
-      <w:pPr>
-        <w:spacing w:before="40" w:after="120" w:line="276" w:lineRule="auto"/>
-      </w:pPr>
-      <w:r>
-        <w:rPr>
-          <w:rFonts w:ascii="Arial" w:hAnsi="Arial"/>
-          <w:b w:val="0"/>
-          <w:color w:val="555555"/>
-          <w:sz w:val="20"/>
-        </w:rPr>
-        <w:t>201 pigs across 7 sizes, 6" through 8.5".</w:t>
-      </w:r>
-    </w:p>
     <w:p>
       <w:pPr>
         <w:keepNext/>
@@ -7160,7 +7146,7 @@
       <w:r>
         <w:drawing>
           <wp:inline xmlns:a="http://schemas.openxmlformats.org/drawingml/2006/main" xmlns:pic="http://schemas.openxmlformats.org/drawingml/2006/picture">
-            <wp:extent cx="5486400" cy="1733550"/>
+            <wp:extent cx="4937760" cy="1975104"/>
             <wp:docPr id="2" name="Picture 2"/>
             <wp:cNvGraphicFramePr>
               <a:graphicFrameLocks noChangeAspect="1"/>
@@ -7169,7 +7155,7 @@
               <a:graphicData uri="http://schemas.openxmlformats.org/drawingml/2006/picture">
                 <pic:pic>
                   <pic:nvPicPr>
-                    <pic:cNvPr id="0" name="USA26046-vac-radiant-outlet-layout.jpg"/>
+                    <pic:cNvPr id="0" name="timeline-PR-170029.png"/>
                     <pic:cNvPicPr/>
                   </pic:nvPicPr>
                   <pic:blipFill>
@@ -7181,105 +7167,7 @@
                   <pic:spPr>
                     <a:xfrm>
                       <a:off x="0" y="0"/>
-                      <a:ext cx="5486400" cy="1733550"/>
-                    </a:xfrm>
-                    <a:prstGeom prst="rect"/>
-                  </pic:spPr>
-                </pic:pic>
-              </a:graphicData>
-            </a:graphic>
-          </wp:inline>
-        </w:drawing>
-      </w:r>
-    </w:p>
-    <w:p>
-      <w:pPr>
-        <w:spacing w:before="0" w:after="120"/>
-        <w:jc w:val="center"/>
-      </w:pPr>
-      <w:r>
-        <w:rPr>
-          <w:rFonts w:ascii="Arial" w:hAnsi="Arial"/>
-          <w:b w:val="0"/>
-          <w:color w:val="888888"/>
-          <w:sz w:val="16"/>
-        </w:rPr>
-        <w:t>Radiant outlet flanges, viewed facing the outlets.</w:t>
-      </w:r>
-    </w:p>
-    <w:tbl>
-      <w:tblPr>
-        <w:tblW w:type="auto" w:w="0"/>
-        <w:tblLook w:firstColumn="1" w:firstRow="1" w:lastColumn="0" w:lastRow="0" w:noHBand="0" w:noVBand="1" w:val="04A0"/>
-        <w:tblLayout w:type="fixed"/>
-        <w:tblCellMar>
-          <w:top w:w="8" w:type="dxa"/>
-          <w:bottom w:w="8" w:type="dxa"/>
-          <w:left w:w="60" w:type="dxa"/>
-          <w:right w:w="60" w:type="dxa"/>
-        </w:tblCellMar>
-      </w:tblPr>
-      <w:tblGrid>
-        <w:gridCol w:w="9936"/>
-      </w:tblGrid>
-      <w:tr>
-        <w:tc>
-          <w:tcPr>
-            <w:tcW w:type="dxa" w:w="9936"/>
-            <w:shd w:val="clear" w:fill="FFFBE6"/>
-            <w:tcBorders>
-              <w:left w:val="single" w:sz="24" w:space="4" w:color="FCC30A"/>
-            </w:tcBorders>
-          </w:tcPr>
-          <w:p>
-            <w:pPr>
-              <w:spacing w:before="20" w:after="20" w:line="240" w:lineRule="auto"/>
-            </w:pPr>
-            <w:r/>
-            <w:r>
-              <w:rPr>
-                <w:rFonts w:ascii="Arial" w:hAnsi="Arial"/>
-                <w:b w:val="0"/>
-                <w:color w:val="555555"/>
-                <w:sz w:val="18"/>
-              </w:rPr>
-              <w:t>The layout above illustrates the correct radiant outlet labels and orientation. Each outlet connects to the convection inlet of the same pass number.</w:t>
-            </w:r>
-          </w:p>
-        </w:tc>
-      </w:tr>
-    </w:tbl>
-    <w:p>
-      <w:pPr>
-        <w:keepNext/>
-        <w:spacing w:before="120" w:after="40"/>
-        <w:jc w:val="center"/>
-      </w:pPr>
-      <w:r>
-        <w:drawing>
-          <wp:inline xmlns:a="http://schemas.openxmlformats.org/drawingml/2006/main" xmlns:pic="http://schemas.openxmlformats.org/drawingml/2006/picture">
-            <wp:extent cx="5852160" cy="2340864"/>
-            <wp:docPr id="3" name="Picture 3"/>
-            <wp:cNvGraphicFramePr>
-              <a:graphicFrameLocks noChangeAspect="1"/>
-            </wp:cNvGraphicFramePr>
-            <a:graphic>
-              <a:graphicData uri="http://schemas.openxmlformats.org/drawingml/2006/picture">
-                <pic:pic>
-                  <pic:nvPicPr>
-                    <pic:cNvPr id="0" name="timeline-PR-170029.png"/>
-                    <pic:cNvPicPr/>
-                  </pic:nvPicPr>
-                  <pic:blipFill>
-                    <a:blip r:embed="rId13"/>
-                    <a:stretch>
-                      <a:fillRect/>
-                    </a:stretch>
-                  </pic:blipFill>
-                  <pic:spPr>
-                    <a:xfrm>
-                      <a:off x="0" y="0"/>
-                      <a:ext cx="5852160" cy="2340864"/>
+                      <a:ext cx="4937760" cy="1975104"/>
                     </a:xfrm>
                     <a:prstGeom prst="rect"/>
                   </pic:spPr>
@@ -7781,20 +7669,6 @@
         </w:tc>
       </w:tr>
     </w:tbl>
-    <w:p>
-      <w:pPr>
-        <w:spacing w:before="40" w:after="120" w:line="276" w:lineRule="auto"/>
-      </w:pPr>
-      <w:r>
-        <w:rPr>
-          <w:rFonts w:ascii="Arial" w:hAnsi="Arial"/>
-          <w:b w:val="0"/>
-          <w:color w:val="555555"/>
-          <w:sz w:val="20"/>
-        </w:rPr>
-        <w:t>97 pigs across 11 sizes, 3.75" through 12".</w:t>
-      </w:r>
-    </w:p>
     <w:p>
       <w:pPr>
         <w:keepNext/>
@@ -11126,7 +11000,8 @@
         </w:tblCellMar>
       </w:tblPr>
       <w:tblGrid>
-        <w:gridCol w:w="9936"/>
+        <w:gridCol w:w="4968"/>
+        <w:gridCol w:w="4968"/>
       </w:tblGrid>
       <w:tr>
         <w:trPr>
@@ -11134,7 +11009,7 @@
         </w:trPr>
         <w:tc>
           <w:tcPr>
-            <w:tcW w:type="dxa" w:w="9936"/>
+            <w:tcW w:type="dxa" w:w="4968"/>
           </w:tcPr>
           <w:p>
             <w:pPr>
@@ -11146,7 +11021,54 @@
             <w:r>
               <w:drawing>
                 <wp:inline xmlns:a="http://schemas.openxmlformats.org/drawingml/2006/main" xmlns:pic="http://schemas.openxmlformats.org/drawingml/2006/picture">
-                  <wp:extent cx="5852160" cy="3787605"/>
+                  <wp:extent cx="3017520" cy="953452"/>
+                  <wp:docPr id="3" name="Picture 3"/>
+                  <wp:cNvGraphicFramePr>
+                    <a:graphicFrameLocks noChangeAspect="1"/>
+                  </wp:cNvGraphicFramePr>
+                  <a:graphic>
+                    <a:graphicData uri="http://schemas.openxmlformats.org/drawingml/2006/picture">
+                      <pic:pic>
+                        <pic:nvPicPr>
+                          <pic:cNvPr id="0" name="USA26046-vac-radiant-outlet-layout.jpg"/>
+                          <pic:cNvPicPr/>
+                        </pic:nvPicPr>
+                        <pic:blipFill>
+                          <a:blip r:embed="rId13"/>
+                          <a:stretch>
+                            <a:fillRect/>
+                          </a:stretch>
+                        </pic:blipFill>
+                        <pic:spPr>
+                          <a:xfrm>
+                            <a:off x="0" y="0"/>
+                            <a:ext cx="3017520" cy="953452"/>
+                          </a:xfrm>
+                          <a:prstGeom prst="rect"/>
+                        </pic:spPr>
+                      </pic:pic>
+                    </a:graphicData>
+                  </a:graphic>
+                </wp:inline>
+              </w:drawing>
+            </w:r>
+          </w:p>
+        </w:tc>
+        <w:tc>
+          <w:tcPr>
+            <w:tcW w:type="dxa" w:w="4968"/>
+          </w:tcPr>
+          <w:p>
+            <w:pPr>
+              <w:keepNext/>
+              <w:spacing w:before="40" w:after="40"/>
+              <w:jc w:val="center"/>
+            </w:pPr>
+            <w:r/>
+            <w:r>
+              <w:drawing>
+                <wp:inline xmlns:a="http://schemas.openxmlformats.org/drawingml/2006/main" xmlns:pic="http://schemas.openxmlformats.org/drawingml/2006/picture">
+                  <wp:extent cx="3017520" cy="1952984"/>
                   <wp:docPr id="4" name="Picture 4"/>
                   <wp:cNvGraphicFramePr>
                     <a:graphicFrameLocks noChangeAspect="1"/>
@@ -11167,7 +11089,7 @@
                         <pic:spPr>
                           <a:xfrm>
                             <a:off x="0" y="0"/>
-                            <a:ext cx="5852160" cy="3787605"/>
+                            <a:ext cx="3017520" cy="1952984"/>
                           </a:xfrm>
                           <a:prstGeom prst="rect"/>
                         </pic:spPr>
@@ -11186,7 +11108,28 @@
         </w:trPr>
         <w:tc>
           <w:tcPr>
-            <w:tcW w:type="dxa" w:w="9936"/>
+            <w:tcW w:type="dxa" w:w="4968"/>
+          </w:tcPr>
+          <w:p>
+            <w:pPr>
+              <w:spacing w:before="20" w:after="20" w:line="240" w:lineRule="auto"/>
+              <w:jc w:val="center"/>
+            </w:pPr>
+            <w:r/>
+            <w:r>
+              <w:rPr>
+                <w:rFonts w:ascii="Arial" w:hAnsi="Arial"/>
+                <w:b w:val="0"/>
+                <w:color w:val="888888"/>
+                <w:sz w:val="16"/>
+              </w:rPr>
+              <w:t>Radiant outlet labels and orientation, viewed facing the outlets. Each outlet connects to the convection inlet of the same pass number.</w:t>
+            </w:r>
+          </w:p>
+        </w:tc>
+        <w:tc>
+          <w:tcPr>
+            <w:tcW w:type="dxa" w:w="4968"/>
           </w:tcPr>
           <w:p>
             <w:pPr>
@@ -11543,7 +11486,7 @@
       <w:r>
         <w:drawing>
           <wp:inline xmlns:a="http://schemas.openxmlformats.org/drawingml/2006/main" xmlns:pic="http://schemas.openxmlformats.org/drawingml/2006/picture">
-            <wp:extent cx="5852160" cy="786384"/>
+            <wp:extent cx="4937760" cy="663512"/>
             <wp:docPr id="5" name="Picture 5"/>
             <wp:cNvGraphicFramePr>
               <a:graphicFrameLocks noChangeAspect="1"/>
@@ -11564,7 +11507,7 @@
                   <pic:spPr>
                     <a:xfrm>
                       <a:off x="0" y="0"/>
-                      <a:ext cx="5852160" cy="786384"/>
+                      <a:ext cx="4937760" cy="663512"/>
                     </a:xfrm>
                     <a:prstGeom prst="rect"/>
                   </pic:spPr>
@@ -11763,20 +11706,6 @@
         </w:tc>
       </w:tr>
     </w:tbl>
-    <w:p>
-      <w:pPr>
-        <w:spacing w:before="40" w:after="120" w:line="276" w:lineRule="auto"/>
-      </w:pPr>
-      <w:r>
-        <w:rPr>
-          <w:rFonts w:ascii="Arial" w:hAnsi="Arial"/>
-          <w:b w:val="0"/>
-          <w:color w:val="555555"/>
-          <w:sz w:val="20"/>
-        </w:rPr>
-        <w:t>16 pigs across 2 sizes, 6" through 6.25".</w:t>
-      </w:r>
-    </w:p>
     <w:p>
       <w:pPr>
         <w:keepNext/>
@@ -12950,7 +12879,7 @@
       <w:r>
         <w:drawing>
           <wp:inline xmlns:a="http://schemas.openxmlformats.org/drawingml/2006/main" xmlns:pic="http://schemas.openxmlformats.org/drawingml/2006/picture">
-            <wp:extent cx="5852160" cy="1060704"/>
+            <wp:extent cx="4937760" cy="894969"/>
             <wp:docPr id="6" name="Picture 6"/>
             <wp:cNvGraphicFramePr>
               <a:graphicFrameLocks noChangeAspect="1"/>
@@ -12971,7 +12900,7 @@
                   <pic:spPr>
                     <a:xfrm>
                       <a:off x="0" y="0"/>
-                      <a:ext cx="5852160" cy="1060704"/>
+                      <a:ext cx="4937760" cy="894969"/>
                     </a:xfrm>
                     <a:prstGeom prst="rect"/>
                   </pic:spPr>
@@ -13033,15 +12962,16 @@
         </w:tblCellMar>
       </w:tblPr>
       <w:tblGrid>
-        <w:gridCol w:w="2484"/>
-        <w:gridCol w:w="2484"/>
-        <w:gridCol w:w="2484"/>
-        <w:gridCol w:w="2484"/>
+        <w:gridCol w:w="1987"/>
+        <w:gridCol w:w="1987"/>
+        <w:gridCol w:w="1987"/>
+        <w:gridCol w:w="1987"/>
+        <w:gridCol w:w="1987"/>
       </w:tblGrid>
       <w:tr>
         <w:tc>
           <w:tcPr>
-            <w:tcW w:type="dxa" w:w="2484"/>
+            <w:tcW w:type="dxa" w:w="1987"/>
             <w:shd w:val="clear" w:fill="222222"/>
           </w:tcPr>
           <w:p>
@@ -13063,7 +12993,7 @@
         </w:tc>
         <w:tc>
           <w:tcPr>
-            <w:tcW w:type="dxa" w:w="2484"/>
+            <w:tcW w:type="dxa" w:w="1987"/>
             <w:shd w:val="clear" w:fill="222222"/>
           </w:tcPr>
           <w:p>
@@ -13085,7 +13015,7 @@
         </w:tc>
         <w:tc>
           <w:tcPr>
-            <w:tcW w:type="dxa" w:w="2484"/>
+            <w:tcW w:type="dxa" w:w="1987"/>
             <w:shd w:val="clear" w:fill="222222"/>
           </w:tcPr>
           <w:p>
@@ -13107,7 +13037,29 @@
         </w:tc>
         <w:tc>
           <w:tcPr>
-            <w:tcW w:type="dxa" w:w="2484"/>
+            <w:tcW w:type="dxa" w:w="1987"/>
+            <w:shd w:val="clear" w:fill="222222"/>
+          </w:tcPr>
+          <w:p>
+            <w:pPr>
+              <w:keepNext/>
+              <w:spacing w:before="20" w:after="20" w:line="240" w:lineRule="auto"/>
+            </w:pPr>
+            <w:r/>
+            <w:r>
+              <w:rPr>
+                <w:rFonts w:ascii="Arial" w:hAnsi="Arial"/>
+                <w:b/>
+                <w:color w:val="FFFFFF"/>
+                <w:sz w:val="16"/>
+              </w:rPr>
+              <w:t>SIZE — QTY</w:t>
+            </w:r>
+          </w:p>
+        </w:tc>
+        <w:tc>
+          <w:tcPr>
+            <w:tcW w:type="dxa" w:w="1987"/>
             <w:shd w:val="clear" w:fill="222222"/>
           </w:tcPr>
           <w:p>
@@ -13131,7 +13083,7 @@
       <w:tr>
         <w:tc>
           <w:tcPr>
-            <w:tcW w:type="dxa" w:w="2484"/>
+            <w:tcW w:type="dxa" w:w="1987"/>
           </w:tcPr>
           <w:p>
             <w:pPr>
@@ -13152,7 +13104,116 @@
         </w:tc>
         <w:tc>
           <w:tcPr>
-            <w:tcW w:type="dxa" w:w="2484"/>
+            <w:tcW w:type="dxa" w:w="1987"/>
+          </w:tcPr>
+          <w:p>
+            <w:pPr>
+              <w:keepNext/>
+              <w:spacing w:before="20" w:after="20" w:line="240" w:lineRule="auto"/>
+            </w:pPr>
+            <w:r/>
+            <w:r>
+              <w:rPr>
+                <w:rFonts w:ascii="Arial" w:hAnsi="Arial"/>
+                <w:b w:val="0"/>
+                <w:color w:val="555555"/>
+                <w:sz w:val="17"/>
+              </w:rPr>
+              <w:t>3.25"  —  6</w:t>
+            </w:r>
+          </w:p>
+        </w:tc>
+        <w:tc>
+          <w:tcPr>
+            <w:tcW w:type="dxa" w:w="1987"/>
+          </w:tcPr>
+          <w:p>
+            <w:pPr>
+              <w:keepNext/>
+              <w:spacing w:before="20" w:after="20" w:line="240" w:lineRule="auto"/>
+            </w:pPr>
+            <w:r/>
+            <w:r>
+              <w:rPr>
+                <w:rFonts w:ascii="Arial" w:hAnsi="Arial"/>
+                <w:b w:val="0"/>
+                <w:color w:val="555555"/>
+                <w:sz w:val="17"/>
+              </w:rPr>
+              <w:t>3.325"  —  3</w:t>
+            </w:r>
+          </w:p>
+        </w:tc>
+        <w:tc>
+          <w:tcPr>
+            <w:tcW w:type="dxa" w:w="1987"/>
+          </w:tcPr>
+          <w:p>
+            <w:pPr>
+              <w:keepNext/>
+              <w:spacing w:before="20" w:after="20" w:line="240" w:lineRule="auto"/>
+            </w:pPr>
+            <w:r/>
+            <w:r>
+              <w:rPr>
+                <w:rFonts w:ascii="Arial" w:hAnsi="Arial"/>
+                <w:b w:val="0"/>
+                <w:color w:val="555555"/>
+                <w:sz w:val="17"/>
+              </w:rPr>
+              <w:t>3.625"  —  21</w:t>
+            </w:r>
+          </w:p>
+        </w:tc>
+        <w:tc>
+          <w:tcPr>
+            <w:tcW w:type="dxa" w:w="1987"/>
+          </w:tcPr>
+          <w:p>
+            <w:pPr>
+              <w:keepNext/>
+              <w:spacing w:before="20" w:after="20" w:line="240" w:lineRule="auto"/>
+            </w:pPr>
+            <w:r/>
+            <w:r>
+              <w:rPr>
+                <w:rFonts w:ascii="Arial" w:hAnsi="Arial"/>
+                <w:b w:val="0"/>
+                <w:color w:val="555555"/>
+                <w:sz w:val="17"/>
+              </w:rPr>
+              <w:t>3.875"  —  4</w:t>
+            </w:r>
+          </w:p>
+        </w:tc>
+      </w:tr>
+      <w:tr>
+        <w:tc>
+          <w:tcPr>
+            <w:tcW w:type="dxa" w:w="1987"/>
+            <w:shd w:val="clear" w:fill="F7F7F7"/>
+          </w:tcPr>
+          <w:p>
+            <w:pPr>
+              <w:keepNext/>
+              <w:spacing w:before="20" w:after="20" w:line="240" w:lineRule="auto"/>
+            </w:pPr>
+            <w:r/>
+            <w:r>
+              <w:rPr>
+                <w:rFonts w:ascii="Arial" w:hAnsi="Arial"/>
+                <w:b w:val="0"/>
+                <w:color w:val="555555"/>
+                <w:sz w:val="17"/>
+              </w:rPr>
+              <w:t>3.125"  —  3</w:t>
+            </w:r>
+          </w:p>
+        </w:tc>
+        <w:tc>
+          <w:tcPr>
+            <w:tcW w:type="dxa" w:w="1987"/>
+            <w:shd w:val="clear" w:fill="F7F7F7"/>
           </w:tcPr>
           <w:p>
             <w:pPr>
@@ -13173,7 +13234,8 @@
         </w:tc>
         <w:tc>
           <w:tcPr>
-            <w:tcW w:type="dxa" w:w="2484"/>
+            <w:tcW w:type="dxa" w:w="1987"/>
+            <w:shd w:val="clear" w:fill="F7F7F7"/>
           </w:tcPr>
           <w:p>
             <w:pPr>
@@ -13188,13 +13250,36 @@
                 <w:color w:val="555555"/>
                 <w:sz w:val="17"/>
               </w:rPr>
-              <w:t>3.625"  —  21</w:t>
+              <w:t>3.5"  —  6</w:t>
             </w:r>
           </w:p>
         </w:tc>
         <w:tc>
           <w:tcPr>
-            <w:tcW w:type="dxa" w:w="2484"/>
+            <w:tcW w:type="dxa" w:w="1987"/>
+            <w:shd w:val="clear" w:fill="F7F7F7"/>
+          </w:tcPr>
+          <w:p>
+            <w:pPr>
+              <w:keepNext/>
+              <w:spacing w:before="20" w:after="20" w:line="240" w:lineRule="auto"/>
+            </w:pPr>
+            <w:r/>
+            <w:r>
+              <w:rPr>
+                <w:rFonts w:ascii="Arial" w:hAnsi="Arial"/>
+                <w:b w:val="0"/>
+                <w:color w:val="555555"/>
+                <w:sz w:val="17"/>
+              </w:rPr>
+              <w:t>3.75"  —  14</w:t>
+            </w:r>
+          </w:p>
+        </w:tc>
+        <w:tc>
+          <w:tcPr>
+            <w:tcW w:type="dxa" w:w="1987"/>
+            <w:shd w:val="clear" w:fill="F7F7F7"/>
           </w:tcPr>
           <w:p>
             <w:pPr>
@@ -13217,181 +13302,7 @@
       <w:tr>
         <w:tc>
           <w:tcPr>
-            <w:tcW w:type="dxa" w:w="2484"/>
-            <w:shd w:val="clear" w:fill="F7F7F7"/>
-          </w:tcPr>
-          <w:p>
-            <w:pPr>
-              <w:keepNext/>
-              <w:spacing w:before="20" w:after="20" w:line="240" w:lineRule="auto"/>
-            </w:pPr>
-            <w:r/>
-            <w:r>
-              <w:rPr>
-                <w:rFonts w:ascii="Arial" w:hAnsi="Arial"/>
-                <w:b w:val="0"/>
-                <w:color w:val="555555"/>
-                <w:sz w:val="17"/>
-              </w:rPr>
-              <w:t>3.125"  —  3</w:t>
-            </w:r>
-          </w:p>
-        </w:tc>
-        <w:tc>
-          <w:tcPr>
-            <w:tcW w:type="dxa" w:w="2484"/>
-            <w:shd w:val="clear" w:fill="F7F7F7"/>
-          </w:tcPr>
-          <w:p>
-            <w:pPr>
-              <w:keepNext/>
-              <w:spacing w:before="20" w:after="20" w:line="240" w:lineRule="auto"/>
-            </w:pPr>
-            <w:r/>
-            <w:r>
-              <w:rPr>
-                <w:rFonts w:ascii="Arial" w:hAnsi="Arial"/>
-                <w:b w:val="0"/>
-                <w:color w:val="555555"/>
-                <w:sz w:val="17"/>
-              </w:rPr>
-              <w:t>3.325"  —  3</w:t>
-            </w:r>
-          </w:p>
-        </w:tc>
-        <w:tc>
-          <w:tcPr>
-            <w:tcW w:type="dxa" w:w="2484"/>
-            <w:shd w:val="clear" w:fill="F7F7F7"/>
-          </w:tcPr>
-          <w:p>
-            <w:pPr>
-              <w:keepNext/>
-              <w:spacing w:before="20" w:after="20" w:line="240" w:lineRule="auto"/>
-            </w:pPr>
-            <w:r/>
-            <w:r>
-              <w:rPr>
-                <w:rFonts w:ascii="Arial" w:hAnsi="Arial"/>
-                <w:b w:val="0"/>
-                <w:color w:val="555555"/>
-                <w:sz w:val="17"/>
-              </w:rPr>
-              <w:t>3.75"  —  14</w:t>
-            </w:r>
-          </w:p>
-        </w:tc>
-        <w:tc>
-          <w:tcPr>
-            <w:tcW w:type="dxa" w:w="2484"/>
-            <w:shd w:val="clear" w:fill="F7F7F7"/>
-          </w:tcPr>
-          <w:p>
-            <w:pPr>
-              <w:keepNext/>
-              <w:spacing w:before="20" w:after="20" w:line="240" w:lineRule="auto"/>
-            </w:pPr>
-            <w:r/>
-            <w:r>
-              <w:rPr>
-                <w:rFonts w:ascii="Arial" w:hAnsi="Arial"/>
-                <w:b w:val="0"/>
-                <w:color w:val="555555"/>
-                <w:sz w:val="17"/>
-              </w:rPr>
-            </w:r>
-          </w:p>
-        </w:tc>
-      </w:tr>
-      <w:tr>
-        <w:tc>
-          <w:tcPr>
-            <w:tcW w:type="dxa" w:w="2484"/>
-          </w:tcPr>
-          <w:p>
-            <w:pPr>
-              <w:keepNext/>
-              <w:spacing w:before="20" w:after="20" w:line="240" w:lineRule="auto"/>
-            </w:pPr>
-            <w:r/>
-            <w:r>
-              <w:rPr>
-                <w:rFonts w:ascii="Arial" w:hAnsi="Arial"/>
-                <w:b w:val="0"/>
-                <w:color w:val="555555"/>
-                <w:sz w:val="17"/>
-              </w:rPr>
-              <w:t>3.25"  —  6</w:t>
-            </w:r>
-          </w:p>
-        </w:tc>
-        <w:tc>
-          <w:tcPr>
-            <w:tcW w:type="dxa" w:w="2484"/>
-          </w:tcPr>
-          <w:p>
-            <w:pPr>
-              <w:keepNext/>
-              <w:spacing w:before="20" w:after="20" w:line="240" w:lineRule="auto"/>
-            </w:pPr>
-            <w:r/>
-            <w:r>
-              <w:rPr>
-                <w:rFonts w:ascii="Arial" w:hAnsi="Arial"/>
-                <w:b w:val="0"/>
-                <w:color w:val="555555"/>
-                <w:sz w:val="17"/>
-              </w:rPr>
-              <w:t>3.5"  —  6</w:t>
-            </w:r>
-          </w:p>
-        </w:tc>
-        <w:tc>
-          <w:tcPr>
-            <w:tcW w:type="dxa" w:w="2484"/>
-          </w:tcPr>
-          <w:p>
-            <w:pPr>
-              <w:keepNext/>
-              <w:spacing w:before="20" w:after="20" w:line="240" w:lineRule="auto"/>
-            </w:pPr>
-            <w:r/>
-            <w:r>
-              <w:rPr>
-                <w:rFonts w:ascii="Arial" w:hAnsi="Arial"/>
-                <w:b w:val="0"/>
-                <w:color w:val="555555"/>
-                <w:sz w:val="17"/>
-              </w:rPr>
-              <w:t>3.875"  —  4</w:t>
-            </w:r>
-          </w:p>
-        </w:tc>
-        <w:tc>
-          <w:tcPr>
-            <w:tcW w:type="dxa" w:w="2484"/>
-          </w:tcPr>
-          <w:p>
-            <w:pPr>
-              <w:keepNext/>
-              <w:spacing w:before="20" w:after="20" w:line="240" w:lineRule="auto"/>
-            </w:pPr>
-            <w:r/>
-            <w:r>
-              <w:rPr>
-                <w:rFonts w:ascii="Arial" w:hAnsi="Arial"/>
-                <w:b w:val="0"/>
-                <w:color w:val="555555"/>
-                <w:sz w:val="17"/>
-              </w:rPr>
-            </w:r>
-          </w:p>
-        </w:tc>
-      </w:tr>
-      <w:tr>
-        <w:tc>
-          <w:tcPr>
-            <w:tcW w:type="dxa" w:w="2484"/>
+            <w:tcW w:type="dxa" w:w="1987"/>
             <w:shd w:val="clear" w:fill="F7F7F7"/>
           </w:tcPr>
           <w:p>
@@ -13412,7 +13323,7 @@
         </w:tc>
         <w:tc>
           <w:tcPr>
-            <w:tcW w:type="dxa" w:w="2484"/>
+            <w:tcW w:type="dxa" w:w="1987"/>
             <w:shd w:val="clear" w:fill="F7F7F7"/>
           </w:tcPr>
           <w:p>
@@ -13432,7 +13343,7 @@
         </w:tc>
         <w:tc>
           <w:tcPr>
-            <w:tcW w:type="dxa" w:w="2484"/>
+            <w:tcW w:type="dxa" w:w="1987"/>
             <w:shd w:val="clear" w:fill="F7F7F7"/>
           </w:tcPr>
           <w:p>
@@ -13452,7 +13363,27 @@
         </w:tc>
         <w:tc>
           <w:tcPr>
-            <w:tcW w:type="dxa" w:w="2484"/>
+            <w:tcW w:type="dxa" w:w="1987"/>
+            <w:shd w:val="clear" w:fill="F7F7F7"/>
+          </w:tcPr>
+          <w:p>
+            <w:pPr>
+              <w:spacing w:before="20" w:after="20" w:line="240" w:lineRule="auto"/>
+            </w:pPr>
+            <w:r/>
+            <w:r>
+              <w:rPr>
+                <w:rFonts w:ascii="Arial" w:hAnsi="Arial"/>
+                <w:b w:val="0"/>
+                <w:color w:val="555555"/>
+                <w:sz w:val="16"/>
+              </w:rPr>
+            </w:r>
+          </w:p>
+        </w:tc>
+        <w:tc>
+          <w:tcPr>
+            <w:tcW w:type="dxa" w:w="1987"/>
             <w:shd w:val="clear" w:fill="F7F7F7"/>
           </w:tcPr>
           <w:p>
@@ -13472,20 +13403,6 @@
         </w:tc>
       </w:tr>
     </w:tbl>
-    <w:p>
-      <w:pPr>
-        <w:spacing w:before="40" w:after="120" w:line="276" w:lineRule="auto"/>
-      </w:pPr>
-      <w:r>
-        <w:rPr>
-          <w:rFonts w:ascii="Arial" w:hAnsi="Arial"/>
-          <w:b w:val="0"/>
-          <w:color w:val="555555"/>
-          <w:sz w:val="20"/>
-        </w:rPr>
-        <w:t>64 pigs across 10 sizes, 3" through 4".</w:t>
-      </w:r>
-    </w:p>
     <w:p>
       <w:pPr>
         <w:keepNext/>
@@ -14352,21 +14269,7 @@
           <w:color w:val="555555"/>
           <w:sz w:val="20"/>
         </w:rPr>
-        <w:t>USADebusk performed the mechanical decoke of four fired heaters for Cenovus at the Lima Refinery during the 2026 turnaround, September 17 – 30: the Crude Furnace (PR-170028), Vacuum Charge Furnace (PR-170029), HDS Furnace (PR-175169) and Coker Furnace (PR-170002). Two Trimax pumping units ran independent schedules — Trimax 6 on the Vacuum heater, and Trimax 5 on the Crude, HDS and Coker in turn. The Crude, Vacuum and HDS heaters were smart-pigged after cleaning.</w:t>
-      </w:r>
-    </w:p>
-    <w:p>
-      <w:pPr>
-        <w:spacing w:before="40" w:after="120" w:line="276" w:lineRule="auto"/>
-      </w:pPr>
-      <w:r>
-        <w:rPr>
-          <w:rFonts w:ascii="Arial" w:hAnsi="Arial"/>
-          <w:b w:val="0"/>
-          <w:color w:val="555555"/>
-          <w:sz w:val="20"/>
-        </w:rPr>
-        <w:t>Fifty-two of the project's 54 stand-by hours were on the Vacuum heater, waiting on the 12" radiant-outlet launchers to be installed and later relocated.</w:t>
+        <w:t>USADebusk performed the mechanical decoke of four fired heaters for Cenovus at the Lima Refinery during the 2026 turnaround, September 17 – 30: the Crude Furnace (PR-170028), Vacuum Charge Furnace (PR-170029), HDS Furnace (PR-175169) and Coker Furnace (PR-170002). Two Trimax pumping units ran independent schedules — Trimax 6 on the Vacuum heater, and Trimax 5 on the Crude, HDS and Coker in turn. The Crude, Vacuum and HDS heaters were smart-pigged after cleaning. Fifty-two of the project's 54 stand-by hours were on the Vacuum heater, waiting on the 12" radiant-outlet launchers to be installed and later relocated.</w:t>
       </w:r>
     </w:p>
     <w:p>
@@ -14428,22 +14331,7 @@
           <w:color w:val="222222"/>
           <w:sz w:val="20"/>
         </w:rPr>
-        <w:t>Jesse Utsey</w:t>
-      </w:r>
-    </w:p>
-    <w:p>
-      <w:pPr>
-        <w:keepNext/>
-        <w:spacing w:before="0" w:after="0"/>
-      </w:pPr>
-      <w:r>
-        <w:rPr>
-          <w:rFonts w:ascii="Arial" w:hAnsi="Arial"/>
-          <w:b w:val="0"/>
-          <w:color w:val="222222"/>
-          <w:sz w:val="20"/>
-        </w:rPr>
-        <w:t>USADebusk</w:t>
+        <w:t>Jesse Utsey  |  Project Manager, USADebusk</w:t>
       </w:r>
     </w:p>
     <w:p>
@@ -14458,7 +14346,7 @@
           <w:color w:val="222222"/>
           <w:sz w:val="20"/>
         </w:rPr>
-        <w:t>Project Manager</w:t>
+        <w:t>713-252-8516  |  JUtsey@USADebusk.com</w:t>
       </w:r>
     </w:p>
     <w:sectPr>

</xml_diff>

<commit_message>
[Lane 1] USA26046: job report split into four per-heater reports; 1/8" pig cells; Coker A+B flow test missing at source
Co-Authored-By: Claude Opus 5.5 <noreply@anthropic.com>
Claude-Session: https://claude.ai/code/session_01Ht6kBvc4F6ALGQpBMyBmaF
</commit_message>
<xml_diff>
--- a/02-facilities/Cenovus/Lima-OH/USA26046-Cenovus-Lima-Job-Report.docx
+++ b/02-facilities/Cenovus/Lima-OH/USA26046-Cenovus-Lima-Job-Report.docx
@@ -7429,7 +7429,7 @@
                 <w:color w:val="555555"/>
                 <w:sz w:val="17"/>
               </w:rPr>
-              <w:t>3.8"  —  1</w:t>
+              <w:t>3.875"  —  1</w:t>
             </w:r>
           </w:p>
         </w:tc>
@@ -13140,7 +13140,7 @@
                 <w:color w:val="555555"/>
                 <w:sz w:val="17"/>
               </w:rPr>
-              <w:t>3.325"  —  3</w:t>
+              <w:t>3.5"  —  6</w:t>
             </w:r>
           </w:p>
         </w:tc>
@@ -13161,7 +13161,7 @@
                 <w:color w:val="555555"/>
                 <w:sz w:val="17"/>
               </w:rPr>
-              <w:t>3.625"  —  21</w:t>
+              <w:t>3.75"  —  14</w:t>
             </w:r>
           </w:p>
         </w:tc>
@@ -13182,7 +13182,7 @@
                 <w:color w:val="555555"/>
                 <w:sz w:val="17"/>
               </w:rPr>
-              <w:t>3.875"  —  4</w:t>
+              <w:t>4"  —  2</w:t>
             </w:r>
           </w:p>
         </w:tc>
@@ -13228,7 +13228,7 @@
                 <w:color w:val="555555"/>
                 <w:sz w:val="17"/>
               </w:rPr>
-              <w:t>3.3"  —  2</w:t>
+              <w:t>3.375"  —  5</w:t>
             </w:r>
           </w:p>
         </w:tc>
@@ -13250,7 +13250,7 @@
                 <w:color w:val="555555"/>
                 <w:sz w:val="17"/>
               </w:rPr>
-              <w:t>3.5"  —  6</w:t>
+              <w:t>3.625"  —  21</w:t>
             </w:r>
           </w:p>
         </w:tc>
@@ -13272,7 +13272,7 @@
                 <w:color w:val="555555"/>
                 <w:sz w:val="17"/>
               </w:rPr>
-              <w:t>3.75"  —  14</w:t>
+              <w:t>3.875"  —  4</w:t>
             </w:r>
           </w:p>
         </w:tc>
@@ -13294,7 +13294,6 @@
                 <w:color w:val="555555"/>
                 <w:sz w:val="17"/>
               </w:rPr>
-              <w:t>4"  —  2</w:t>
             </w:r>
           </w:p>
         </w:tc>

</xml_diff>

<commit_message>
[Lane 1] USA26046 Coker: radiant A+B flow test added (Jesse's sheet); Coker report 3-across, combined report updated
Co-Authored-By: Claude Opus 5.5 <noreply@anthropic.com>
Claude-Session: https://claude.ai/code/session_01Ht6kBvc4F6ALGQpBMyBmaF
</commit_message>
<xml_diff>
--- a/02-facilities/Cenovus/Lima-OH/USA26046-Cenovus-Lima-Job-Report.docx
+++ b/02-facilities/Cenovus/Lima-OH/USA26046-Cenovus-Lima-Job-Report.docx
@@ -13857,6 +13857,432 @@
                 <w:color w:val="FCC30A"/>
                 <w:sz w:val="19"/>
               </w:rPr>
+              <w:t>Passes A + B</w:t>
+            </w:r>
+          </w:p>
+          <w:tbl>
+            <w:tblPr>
+              <w:tblW w:type="auto" w:w="0"/>
+              <w:tblLook w:firstColumn="1" w:firstRow="1" w:lastColumn="0" w:lastRow="0" w:noHBand="0" w:noVBand="1" w:val="04A0"/>
+              <w:tblLayout w:type="fixed"/>
+              <w:tblBorders>
+                <w:top w:val="single" w:sz="4" w:space="0" w:color="DDDDDD"/>
+                <w:left w:val="single" w:sz="4" w:space="0" w:color="DDDDDD"/>
+                <w:bottom w:val="single" w:sz="4" w:space="0" w:color="DDDDDD"/>
+                <w:right w:val="single" w:sz="4" w:space="0" w:color="DDDDDD"/>
+                <w:insideH w:val="single" w:sz="4" w:space="0" w:color="DDDDDD"/>
+                <w:insideV w:val="single" w:sz="4" w:space="0" w:color="DDDDDD"/>
+              </w:tblBorders>
+              <w:tblCellMar>
+                <w:top w:w="8" w:type="dxa"/>
+                <w:bottom w:w="8" w:type="dxa"/>
+                <w:left w:w="60" w:type="dxa"/>
+                <w:right w:w="60" w:type="dxa"/>
+              </w:tblCellMar>
+            </w:tblPr>
+            <w:tblGrid>
+              <w:gridCol w:w="1054"/>
+              <w:gridCol w:w="1294"/>
+              <w:gridCol w:w="1294"/>
+              <w:gridCol w:w="1150"/>
+            </w:tblGrid>
+            <w:tr>
+              <w:tc>
+                <w:tcPr>
+                  <w:tcW w:type="dxa" w:w="1055"/>
+                  <w:shd w:val="clear" w:fill="222222"/>
+                </w:tcPr>
+                <w:p>
+                  <w:pPr>
+                    <w:spacing w:before="20" w:after="20" w:line="240" w:lineRule="auto"/>
+                  </w:pPr>
+                  <w:r/>
+                  <w:r>
+                    <w:rPr>
+                      <w:rFonts w:ascii="Arial" w:hAnsi="Arial"/>
+                      <w:b/>
+                      <w:color w:val="FFFFFF"/>
+                      <w:sz w:val="15"/>
+                    </w:rPr>
+                    <w:t>GPM</w:t>
+                  </w:r>
+                </w:p>
+              </w:tc>
+              <w:tc>
+                <w:tcPr>
+                  <w:tcW w:type="dxa" w:w="1295"/>
+                  <w:shd w:val="clear" w:fill="222222"/>
+                </w:tcPr>
+                <w:p>
+                  <w:pPr>
+                    <w:spacing w:before="20" w:after="20" w:line="240" w:lineRule="auto"/>
+                  </w:pPr>
+                  <w:r/>
+                  <w:r>
+                    <w:rPr>
+                      <w:rFonts w:ascii="Arial" w:hAnsi="Arial"/>
+                      <w:b/>
+                      <w:color w:val="FFFFFF"/>
+                      <w:sz w:val="15"/>
+                    </w:rPr>
+                    <w:t>BEFORE PSI</w:t>
+                  </w:r>
+                </w:p>
+              </w:tc>
+              <w:tc>
+                <w:tcPr>
+                  <w:tcW w:type="dxa" w:w="1295"/>
+                  <w:shd w:val="clear" w:fill="222222"/>
+                </w:tcPr>
+                <w:p>
+                  <w:pPr>
+                    <w:spacing w:before="20" w:after="20" w:line="240" w:lineRule="auto"/>
+                  </w:pPr>
+                  <w:r/>
+                  <w:r>
+                    <w:rPr>
+                      <w:rFonts w:ascii="Arial" w:hAnsi="Arial"/>
+                      <w:b/>
+                      <w:color w:val="FFFFFF"/>
+                      <w:sz w:val="15"/>
+                    </w:rPr>
+                    <w:t>AFTER PSI</w:t>
+                  </w:r>
+                </w:p>
+              </w:tc>
+              <w:tc>
+                <w:tcPr>
+                  <w:tcW w:type="dxa" w:w="1151"/>
+                  <w:shd w:val="clear" w:fill="222222"/>
+                </w:tcPr>
+                <w:p>
+                  <w:pPr>
+                    <w:spacing w:before="20" w:after="20" w:line="240" w:lineRule="auto"/>
+                  </w:pPr>
+                  <w:r/>
+                  <w:r>
+                    <w:rPr>
+                      <w:rFonts w:ascii="Arial" w:hAnsi="Arial"/>
+                      <w:b/>
+                      <w:color w:val="FFFFFF"/>
+                      <w:sz w:val="15"/>
+                    </w:rPr>
+                    <w:t>Δ PSI</w:t>
+                  </w:r>
+                </w:p>
+              </w:tc>
+            </w:tr>
+            <w:tr>
+              <w:tc>
+                <w:tcPr>
+                  <w:tcW w:type="dxa" w:w="1055"/>
+                </w:tcPr>
+                <w:p>
+                  <w:pPr>
+                    <w:spacing w:before="20" w:after="20" w:line="240" w:lineRule="auto"/>
+                    <w:jc w:val="center"/>
+                  </w:pPr>
+                  <w:r/>
+                  <w:r>
+                    <w:rPr>
+                      <w:rFonts w:ascii="Arial" w:hAnsi="Arial"/>
+                      <w:b w:val="0"/>
+                      <w:color w:val="555555"/>
+                      <w:sz w:val="17"/>
+                    </w:rPr>
+                    <w:t>350</w:t>
+                  </w:r>
+                </w:p>
+              </w:tc>
+              <w:tc>
+                <w:tcPr>
+                  <w:tcW w:type="dxa" w:w="1295"/>
+                </w:tcPr>
+                <w:p>
+                  <w:pPr>
+                    <w:spacing w:before="20" w:after="20" w:line="240" w:lineRule="auto"/>
+                    <w:jc w:val="center"/>
+                  </w:pPr>
+                  <w:r/>
+                  <w:r>
+                    <w:rPr>
+                      <w:rFonts w:ascii="Arial" w:hAnsi="Arial"/>
+                      <w:b w:val="0"/>
+                      <w:color w:val="555555"/>
+                      <w:sz w:val="17"/>
+                    </w:rPr>
+                    <w:t>370</w:t>
+                  </w:r>
+                </w:p>
+              </w:tc>
+              <w:tc>
+                <w:tcPr>
+                  <w:tcW w:type="dxa" w:w="1295"/>
+                </w:tcPr>
+                <w:p>
+                  <w:pPr>
+                    <w:spacing w:before="20" w:after="20" w:line="240" w:lineRule="auto"/>
+                    <w:jc w:val="center"/>
+                  </w:pPr>
+                  <w:r/>
+                  <w:r>
+                    <w:rPr>
+                      <w:rFonts w:ascii="Arial" w:hAnsi="Arial"/>
+                      <w:b w:val="0"/>
+                      <w:color w:val="555555"/>
+                      <w:sz w:val="17"/>
+                    </w:rPr>
+                    <w:t>275</w:t>
+                  </w:r>
+                </w:p>
+              </w:tc>
+              <w:tc>
+                <w:tcPr>
+                  <w:tcW w:type="dxa" w:w="1151"/>
+                </w:tcPr>
+                <w:p>
+                  <w:pPr>
+                    <w:spacing w:before="20" w:after="20" w:line="240" w:lineRule="auto"/>
+                    <w:jc w:val="center"/>
+                  </w:pPr>
+                  <w:r/>
+                  <w:r>
+                    <w:rPr>
+                      <w:rFonts w:ascii="Arial" w:hAnsi="Arial"/>
+                      <w:b w:val="0"/>
+                      <w:color w:val="555555"/>
+                      <w:sz w:val="17"/>
+                    </w:rPr>
+                    <w:t>95</w:t>
+                  </w:r>
+                </w:p>
+              </w:tc>
+            </w:tr>
+            <w:tr>
+              <w:tc>
+                <w:tcPr>
+                  <w:tcW w:type="dxa" w:w="1055"/>
+                  <w:shd w:val="clear" w:fill="F7F7F7"/>
+                </w:tcPr>
+                <w:p>
+                  <w:pPr>
+                    <w:spacing w:before="20" w:after="20" w:line="240" w:lineRule="auto"/>
+                    <w:jc w:val="center"/>
+                  </w:pPr>
+                  <w:r/>
+                  <w:r>
+                    <w:rPr>
+                      <w:rFonts w:ascii="Arial" w:hAnsi="Arial"/>
+                      <w:b w:val="0"/>
+                      <w:color w:val="555555"/>
+                      <w:sz w:val="17"/>
+                    </w:rPr>
+                    <w:t>300</w:t>
+                  </w:r>
+                </w:p>
+              </w:tc>
+              <w:tc>
+                <w:tcPr>
+                  <w:tcW w:type="dxa" w:w="1295"/>
+                  <w:shd w:val="clear" w:fill="F7F7F7"/>
+                </w:tcPr>
+                <w:p>
+                  <w:pPr>
+                    <w:spacing w:before="20" w:after="20" w:line="240" w:lineRule="auto"/>
+                    <w:jc w:val="center"/>
+                  </w:pPr>
+                  <w:r/>
+                  <w:r>
+                    <w:rPr>
+                      <w:rFonts w:ascii="Arial" w:hAnsi="Arial"/>
+                      <w:b w:val="0"/>
+                      <w:color w:val="555555"/>
+                      <w:sz w:val="17"/>
+                    </w:rPr>
+                    <w:t>290</w:t>
+                  </w:r>
+                </w:p>
+              </w:tc>
+              <w:tc>
+                <w:tcPr>
+                  <w:tcW w:type="dxa" w:w="1295"/>
+                  <w:shd w:val="clear" w:fill="F7F7F7"/>
+                </w:tcPr>
+                <w:p>
+                  <w:pPr>
+                    <w:spacing w:before="20" w:after="20" w:line="240" w:lineRule="auto"/>
+                    <w:jc w:val="center"/>
+                  </w:pPr>
+                  <w:r/>
+                  <w:r>
+                    <w:rPr>
+                      <w:rFonts w:ascii="Arial" w:hAnsi="Arial"/>
+                      <w:b w:val="0"/>
+                      <w:color w:val="555555"/>
+                      <w:sz w:val="17"/>
+                    </w:rPr>
+                    <w:t>200</w:t>
+                  </w:r>
+                </w:p>
+              </w:tc>
+              <w:tc>
+                <w:tcPr>
+                  <w:tcW w:type="dxa" w:w="1151"/>
+                  <w:shd w:val="clear" w:fill="F7F7F7"/>
+                </w:tcPr>
+                <w:p>
+                  <w:pPr>
+                    <w:spacing w:before="20" w:after="20" w:line="240" w:lineRule="auto"/>
+                    <w:jc w:val="center"/>
+                  </w:pPr>
+                  <w:r/>
+                  <w:r>
+                    <w:rPr>
+                      <w:rFonts w:ascii="Arial" w:hAnsi="Arial"/>
+                      <w:b w:val="0"/>
+                      <w:color w:val="555555"/>
+                      <w:sz w:val="17"/>
+                    </w:rPr>
+                    <w:t>90</w:t>
+                  </w:r>
+                </w:p>
+              </w:tc>
+            </w:tr>
+            <w:tr>
+              <w:tc>
+                <w:tcPr>
+                  <w:tcW w:type="dxa" w:w="1055"/>
+                </w:tcPr>
+                <w:p>
+                  <w:pPr>
+                    <w:spacing w:before="20" w:after="20" w:line="240" w:lineRule="auto"/>
+                    <w:jc w:val="center"/>
+                  </w:pPr>
+                  <w:r/>
+                  <w:r>
+                    <w:rPr>
+                      <w:rFonts w:ascii="Arial" w:hAnsi="Arial"/>
+                      <w:b w:val="0"/>
+                      <w:color w:val="555555"/>
+                      <w:sz w:val="17"/>
+                    </w:rPr>
+                    <w:t>250</w:t>
+                  </w:r>
+                </w:p>
+              </w:tc>
+              <w:tc>
+                <w:tcPr>
+                  <w:tcW w:type="dxa" w:w="1295"/>
+                </w:tcPr>
+                <w:p>
+                  <w:pPr>
+                    <w:spacing w:before="20" w:after="20" w:line="240" w:lineRule="auto"/>
+                    <w:jc w:val="center"/>
+                  </w:pPr>
+                  <w:r/>
+                  <w:r>
+                    <w:rPr>
+                      <w:rFonts w:ascii="Arial" w:hAnsi="Arial"/>
+                      <w:b w:val="0"/>
+                      <w:color w:val="555555"/>
+                      <w:sz w:val="17"/>
+                    </w:rPr>
+                    <w:t>210</w:t>
+                  </w:r>
+                </w:p>
+              </w:tc>
+              <w:tc>
+                <w:tcPr>
+                  <w:tcW w:type="dxa" w:w="1295"/>
+                </w:tcPr>
+                <w:p>
+                  <w:pPr>
+                    <w:spacing w:before="20" w:after="20" w:line="240" w:lineRule="auto"/>
+                    <w:jc w:val="center"/>
+                  </w:pPr>
+                  <w:r/>
+                  <w:r>
+                    <w:rPr>
+                      <w:rFonts w:ascii="Arial" w:hAnsi="Arial"/>
+                      <w:b w:val="0"/>
+                      <w:color w:val="555555"/>
+                      <w:sz w:val="17"/>
+                    </w:rPr>
+                    <w:t>146</w:t>
+                  </w:r>
+                </w:p>
+              </w:tc>
+              <w:tc>
+                <w:tcPr>
+                  <w:tcW w:type="dxa" w:w="1151"/>
+                </w:tcPr>
+                <w:p>
+                  <w:pPr>
+                    <w:spacing w:before="20" w:after="20" w:line="240" w:lineRule="auto"/>
+                    <w:jc w:val="center"/>
+                  </w:pPr>
+                  <w:r/>
+                  <w:r>
+                    <w:rPr>
+                      <w:rFonts w:ascii="Arial" w:hAnsi="Arial"/>
+                      <w:b w:val="0"/>
+                      <w:color w:val="555555"/>
+                      <w:sz w:val="17"/>
+                    </w:rPr>
+                    <w:t>64</w:t>
+                  </w:r>
+                </w:p>
+              </w:tc>
+            </w:tr>
+          </w:tbl>
+          <w:p/>
+        </w:tc>
+      </w:tr>
+    </w:tbl>
+    <w:tbl>
+      <w:tblPr>
+        <w:tblW w:type="auto" w:w="0"/>
+        <w:tblLook w:firstColumn="1" w:firstRow="1" w:lastColumn="0" w:lastRow="0" w:noHBand="0" w:noVBand="1" w:val="04A0"/>
+        <w:tblBorders>
+          <w:top w:val="nil"/>
+          <w:left w:val="nil"/>
+          <w:bottom w:val="nil"/>
+          <w:right w:val="nil"/>
+          <w:insideH w:val="nil"/>
+          <w:insideV w:val="nil"/>
+        </w:tblBorders>
+        <w:tblLayout w:type="fixed"/>
+        <w:tblCellMar>
+          <w:top w:w="8" w:type="dxa"/>
+          <w:bottom w:w="8" w:type="dxa"/>
+          <w:left w:w="60" w:type="dxa"/>
+          <w:right w:w="60" w:type="dxa"/>
+        </w:tblCellMar>
+      </w:tblPr>
+      <w:tblGrid>
+        <w:gridCol w:w="4968"/>
+        <w:gridCol w:w="4968"/>
+      </w:tblGrid>
+      <w:tr>
+        <w:trPr>
+          <w:cantSplit/>
+        </w:trPr>
+        <w:tc>
+          <w:tcPr>
+            <w:tcW w:type="dxa" w:w="4968"/>
+          </w:tcPr>
+          <w:p>
+            <w:pPr>
+              <w:spacing w:before="120" w:after="40"/>
+            </w:pPr>
+            <w:r/>
+            <w:r>
+              <w:rPr>
+                <w:rFonts w:ascii="Arial" w:hAnsi="Arial"/>
+                <w:b/>
+                <w:color w:val="FCC30A"/>
+                <w:sz w:val="19"/>
+              </w:rPr>
               <w:t>Passes C + D</w:t>
             </w:r>
           </w:p>
@@ -14235,6 +14661,12 @@
               </w:tc>
             </w:tr>
           </w:tbl>
+          <w:p/>
+        </w:tc>
+        <w:tc>
+          <w:tcPr>
+            <w:tcW w:type="dxa" w:w="4968"/>
+          </w:tcPr>
           <w:p/>
         </w:tc>
       </w:tr>

</xml_diff>

<commit_message>
[Lane 1] USA26046: full signature blocks (Peter Campbell on Crude/HDS/Coker, Jesse Utsey on Vac + combined); recorded in build spec
Co-Authored-By: Claude Opus 5.5 <noreply@anthropic.com>
Claude-Session: https://claude.ai/code/session_01Ht6kBvc4F6ALGQpBMyBmaF
</commit_message>
<xml_diff>
--- a/02-facilities/Cenovus/Lima-OH/USA26046-Cenovus-Lima-Job-Report.docx
+++ b/02-facilities/Cenovus/Lima-OH/USA26046-Cenovus-Lima-Job-Report.docx
@@ -14762,7 +14762,7 @@
           <w:color w:val="222222"/>
           <w:sz w:val="20"/>
         </w:rPr>
-        <w:t>Jesse Utsey  |  Project Manager, USADebusk</w:t>
+        <w:t>Jesse Utsey  |  Pigging Operations</w:t>
       </w:r>
     </w:p>
     <w:p>
@@ -14777,7 +14777,7 @@
           <w:color w:val="222222"/>
           <w:sz w:val="20"/>
         </w:rPr>
-        <w:t>713-252-8516  |  JUtsey@USADebusk.com</w:t>
+        <w:t>Cell: 713-252-8516  |  jutsey@usadebusk.com</w:t>
       </w:r>
     </w:p>
     <w:sectPr>

</xml_diff>